<commit_message>
Add full-stack backend, store-submission package, and 401 token recovery
- server/: FastAPI backend (scoring, safety, chat/LLM, WS bus, public data
  adapters with snapshot fallback) + pytest suite (20 passing)
- app/: PWA install-ready (manifest id/scope/screenshots/shortcuts/maskable,
  iOS meta), cloud-mode client with local fallback
- Store packaging: render.yaml (free hosting), packaging/android (TWA/Bubblewrap),
  packaging/ios (Capacitor), assetlinks.json + serving route, store/legal docs,
  store/스토어_제출_런북.md runbook
- Fix: API.post now re-registers the anonymous device and retries once on 401
  (stale/expired token); previously authed calls silently fell back to local
  and never reached the B2G dashboard. Verified 401→/devices 201→/hikes 201.

Co-Authored-By: Claude Opus 4.8 <noreply@anthropic.com>
</commit_message>
<xml_diff>
--- a/deliverables/숲길동무_기획서_제품서비스개발부문.docx
+++ b/deliverables/숲길동무_기획서_제품서비스개발부문.docx
@@ -4696,7 +4696,7 @@
           <w:bCs/>
           <w:color w:val="2D6A4F"/>
         </w:rPr>
-        <w:t xml:space="preserve">4-2. 서비스 구성 — 관제 웹 (B2G)</w:t>
+        <w:t xml:space="preserve">4-2. 서비스 구성 — 웹 (랜딩 + B2G 관제)</w:t>
       </w:r>
     </w:p>
     <w:p>
@@ -4758,7 +4758,7 @@
           <w:sz w:val="18"/>
           <w:szCs w:val="18"/>
         </w:rPr>
-        <w:t xml:space="preserve">지자체·국립공원·소방용 실시간 관제 대시보드 (개발 완료 프로토타입)</w:t>
+        <w:t xml:space="preserve">지자체·국립공원·소방용 실시간 관제 대시보드 — 실시간 산행자 분포·이벤트 피드·AI 위험도 (개발 완료)</w:t>
       </w:r>
     </w:p>
     <w:p>
@@ -4769,21 +4769,7 @@
         <w:rPr>
           <w:color w:val="1D2B22"/>
         </w:rPr>
-        <w:t xml:space="preserve">실시간 산행자 분포(익명화), 구간별 AI 위험도, SOS 사건 추적, 시간대별 입산 수요예측을 제공해 관할 기관의 선제 대응을 지원합니다.</w:t>
-      </w:r>
-    </w:p>
-    <w:p>
-      <w:pPr>
-        <w:pStyle w:val="Heading2"/>
-        <w:spacing w:after="120" w:before="240"/>
-      </w:pPr>
-      <w:r>
-        <w:rPr>
-          <w:b/>
-          <w:bCs/>
-          <w:color w:val="2D6A4F"/>
-        </w:rPr>
-        <w:t xml:space="preserve">4-3. 시스템 구성도 및 핵심 AI 기술</w:t>
+        <w:t xml:space="preserve">실시간 산행자 분포(익명화), 구간별 AI 위험도, SOS 사건 추적, 시간대별 입산 수요예측을 제공해 관할 기관의 선제 대응을 지원합니다. 관제 화면의 시계·이벤트 피드·산행자 위치는 실시간으로 갱신됩니다.</w:t>
       </w:r>
     </w:p>
     <w:p>
@@ -4794,9 +4780,9 @@
       <w:r>
         <w:drawing>
           <wp:inline distT="0" distB="0" distL="0" distR="0">
-            <wp:extent cx="6096000" cy="3171825"/>
+            <wp:extent cx="5143500" cy="3362325"/>
             <wp:effectExtent t="0" r="0" b="0" l="0"/>
-            <wp:docPr id="1" name="diagram_arch.png" descr="diagram_arch.png" title="diagram_arch.png"/>
+            <wp:docPr id="1" name="landing.png" descr="landing.png" title="landing.png"/>
             <wp:cNvGraphicFramePr>
               <a:graphicFrameLocks xmlns:a="http://schemas.openxmlformats.org/drawingml/2006/main" noChangeAspect="1"/>
             </wp:cNvGraphicFramePr>
@@ -4819,7 +4805,7 @@
                   <pic:spPr bwMode="auto">
                     <a:xfrm>
                       <a:off x="0" y="0"/>
-                      <a:ext cx="6096000" cy="3171825"/>
+                      <a:ext cx="5143500" cy="3362325"/>
                     </a:xfrm>
                     <a:prstGeom prst="rect">
                       <a:avLst/>
@@ -4832,1565 +4818,20 @@
         </w:drawing>
       </w:r>
     </w:p>
-    <w:tbl>
-      <w:tblPr>
-        <w:tblW w:type="dxa" w:w="9638"/>
-        <w:tblBorders>
-          <w:top w:val="single" w:color="auto" w:sz="4"/>
-          <w:left w:val="single" w:color="auto" w:sz="4"/>
-          <w:bottom w:val="single" w:color="auto" w:sz="4"/>
-          <w:right w:val="single" w:color="auto" w:sz="4"/>
-          <w:insideH w:val="single" w:color="auto" w:sz="4"/>
-          <w:insideV w:val="single" w:color="auto" w:sz="4"/>
-        </w:tblBorders>
-      </w:tblPr>
-      <w:tblGrid>
-        <w:gridCol w:w="2300"/>
-        <w:gridCol w:w="3300"/>
-        <w:gridCol w:w="4038"/>
-      </w:tblGrid>
-      <w:tr>
-        <w:trPr>
-          <w:tblHeader/>
-        </w:trPr>
-        <w:tc>
-          <w:tcPr>
-            <w:tcW w:type="dxa" w:w="2300"/>
-            <w:tcBorders>
-              <w:top w:val="single" w:color="C9D8CC" w:sz="2"/>
-              <w:left w:val="single" w:color="C9D8CC" w:sz="2"/>
-              <w:bottom w:val="single" w:color="C9D8CC" w:sz="2"/>
-              <w:right w:val="single" w:color="C9D8CC" w:sz="2"/>
-            </w:tcBorders>
-            <w:shd w:fill="1B4332" w:val="clear"/>
-            <w:tcMar>
-              <w:top w:type="dxa" w:w="70"/>
-              <w:left w:type="dxa" w:w="110"/>
-              <w:bottom w:type="dxa" w:w="70"/>
-              <w:right w:type="dxa" w:w="110"/>
-            </w:tcMar>
-            <w:vAlign w:val="center"/>
-          </w:tcPr>
-          <w:p>
-            <w:pPr>
-              <w:spacing w:after="20" w:line="276"/>
-              <w:jc w:val="center"/>
-            </w:pPr>
-            <w:r>
-              <w:rPr>
-                <w:b/>
-                <w:bCs/>
-                <w:color w:val="FFFFFF"/>
-                <w:sz w:val="18"/>
-                <w:szCs w:val="18"/>
-              </w:rPr>
-              <w:t xml:space="preserve">AI 엔진</w:t>
-            </w:r>
-          </w:p>
-        </w:tc>
-        <w:tc>
-          <w:tcPr>
-            <w:tcW w:type="dxa" w:w="3300"/>
-            <w:tcBorders>
-              <w:top w:val="single" w:color="C9D8CC" w:sz="2"/>
-              <w:left w:val="single" w:color="C9D8CC" w:sz="2"/>
-              <w:bottom w:val="single" w:color="C9D8CC" w:sz="2"/>
-              <w:right w:val="single" w:color="C9D8CC" w:sz="2"/>
-            </w:tcBorders>
-            <w:shd w:fill="1B4332" w:val="clear"/>
-            <w:tcMar>
-              <w:top w:type="dxa" w:w="70"/>
-              <w:left w:type="dxa" w:w="110"/>
-              <w:bottom w:type="dxa" w:w="70"/>
-              <w:right w:type="dxa" w:w="110"/>
-            </w:tcMar>
-            <w:vAlign w:val="center"/>
-          </w:tcPr>
-          <w:p>
-            <w:pPr>
-              <w:spacing w:after="20" w:line="276"/>
-              <w:jc w:val="center"/>
-            </w:pPr>
-            <w:r>
-              <w:rPr>
-                <w:b/>
-                <w:bCs/>
-                <w:color w:val="FFFFFF"/>
-                <w:sz w:val="18"/>
-                <w:szCs w:val="18"/>
-              </w:rPr>
-              <w:t xml:space="preserve">모델·기법</w:t>
-            </w:r>
-          </w:p>
-        </w:tc>
-        <w:tc>
-          <w:tcPr>
-            <w:tcW w:type="dxa" w:w="4038"/>
-            <w:tcBorders>
-              <w:top w:val="single" w:color="C9D8CC" w:sz="2"/>
-              <w:left w:val="single" w:color="C9D8CC" w:sz="2"/>
-              <w:bottom w:val="single" w:color="C9D8CC" w:sz="2"/>
-              <w:right w:val="single" w:color="C9D8CC" w:sz="2"/>
-            </w:tcBorders>
-            <w:shd w:fill="1B4332" w:val="clear"/>
-            <w:tcMar>
-              <w:top w:type="dxa" w:w="70"/>
-              <w:left w:type="dxa" w:w="110"/>
-              <w:bottom w:type="dxa" w:w="70"/>
-              <w:right w:type="dxa" w:w="110"/>
-            </w:tcMar>
-            <w:vAlign w:val="center"/>
-          </w:tcPr>
-          <w:p>
-            <w:pPr>
-              <w:spacing w:after="20" w:line="276"/>
-              <w:jc w:val="center"/>
-            </w:pPr>
-            <w:r>
-              <w:rPr>
-                <w:b/>
-                <w:bCs/>
-                <w:color w:val="FFFFFF"/>
-                <w:sz w:val="18"/>
-                <w:szCs w:val="18"/>
-              </w:rPr>
-              <w:t xml:space="preserve">입력 데이터 → 출력</w:t>
-            </w:r>
-          </w:p>
-        </w:tc>
-      </w:tr>
-      <w:tr>
-        <w:tc>
-          <w:tcPr>
-            <w:tcW w:type="dxa" w:w="2300"/>
-            <w:tcBorders>
-              <w:top w:val="single" w:color="C9D8CC" w:sz="2"/>
-              <w:left w:val="single" w:color="C9D8CC" w:sz="2"/>
-              <w:bottom w:val="single" w:color="C9D8CC" w:sz="2"/>
-              <w:right w:val="single" w:color="C9D8CC" w:sz="2"/>
-            </w:tcBorders>
-            <w:tcMar>
-              <w:top w:type="dxa" w:w="70"/>
-              <w:left w:type="dxa" w:w="110"/>
-              <w:bottom w:type="dxa" w:w="70"/>
-              <w:right w:type="dxa" w:w="110"/>
-            </w:tcMar>
-            <w:vAlign w:val="center"/>
-          </w:tcPr>
-          <w:p>
-            <w:pPr>
-              <w:spacing w:after="20" w:line="276"/>
-              <w:jc w:val="left"/>
-            </w:pPr>
-            <w:r>
-              <w:rPr>
-                <w:b w:val="false"/>
-                <w:bCs w:val="false"/>
-                <w:color w:val="1D2B22"/>
-                <w:sz w:val="18"/>
-                <w:szCs w:val="18"/>
-              </w:rPr>
-              <w:t xml:space="preserve">코스 추천</w:t>
-            </w:r>
-          </w:p>
-        </w:tc>
-        <w:tc>
-          <w:tcPr>
-            <w:tcW w:type="dxa" w:w="3300"/>
-            <w:tcBorders>
-              <w:top w:val="single" w:color="C9D8CC" w:sz="2"/>
-              <w:left w:val="single" w:color="C9D8CC" w:sz="2"/>
-              <w:bottom w:val="single" w:color="C9D8CC" w:sz="2"/>
-              <w:right w:val="single" w:color="C9D8CC" w:sz="2"/>
-            </w:tcBorders>
-            <w:tcMar>
-              <w:top w:type="dxa" w:w="70"/>
-              <w:left w:type="dxa" w:w="110"/>
-              <w:bottom w:type="dxa" w:w="70"/>
-              <w:right w:type="dxa" w:w="110"/>
-            </w:tcMar>
-            <w:vAlign w:val="center"/>
-          </w:tcPr>
-          <w:p>
-            <w:pPr>
-              <w:spacing w:after="20" w:line="276"/>
-              <w:jc w:val="left"/>
-            </w:pPr>
-            <w:r>
-              <w:rPr>
-                <w:b w:val="false"/>
-                <w:bCs w:val="false"/>
-                <w:color w:val="1D2B22"/>
-                <w:sz w:val="18"/>
-                <w:szCs w:val="18"/>
-              </w:rPr>
-              <w:t xml:space="preserve">하이브리드 필터링 + 체력 프로파일</w:t>
-            </w:r>
-          </w:p>
-        </w:tc>
-        <w:tc>
-          <w:tcPr>
-            <w:tcW w:type="dxa" w:w="4038"/>
-            <w:tcBorders>
-              <w:top w:val="single" w:color="C9D8CC" w:sz="2"/>
-              <w:left w:val="single" w:color="C9D8CC" w:sz="2"/>
-              <w:bottom w:val="single" w:color="C9D8CC" w:sz="2"/>
-              <w:right w:val="single" w:color="C9D8CC" w:sz="2"/>
-            </w:tcBorders>
-            <w:tcMar>
-              <w:top w:type="dxa" w:w="70"/>
-              <w:left w:type="dxa" w:w="110"/>
-              <w:bottom w:type="dxa" w:w="70"/>
-              <w:right w:type="dxa" w:w="110"/>
-            </w:tcMar>
-            <w:vAlign w:val="center"/>
-          </w:tcPr>
-          <w:p>
-            <w:pPr>
-              <w:spacing w:after="20" w:line="276"/>
-              <w:jc w:val="left"/>
-            </w:pPr>
-            <w:r>
-              <w:rPr>
-                <w:b w:val="false"/>
-                <w:bCs w:val="false"/>
-                <w:color w:val="1D2B22"/>
-                <w:sz w:val="18"/>
-                <w:szCs w:val="18"/>
-              </w:rPr>
-              <w:t xml:space="preserve">등산로·혼잡·기상·개인 이력 → 매칭률 상위 코스</w:t>
-            </w:r>
-          </w:p>
-        </w:tc>
-      </w:tr>
-      <w:tr>
-        <w:tc>
-          <w:tcPr>
-            <w:tcW w:type="dxa" w:w="2300"/>
-            <w:tcBorders>
-              <w:top w:val="single" w:color="C9D8CC" w:sz="2"/>
-              <w:left w:val="single" w:color="C9D8CC" w:sz="2"/>
-              <w:bottom w:val="single" w:color="C9D8CC" w:sz="2"/>
-              <w:right w:val="single" w:color="C9D8CC" w:sz="2"/>
-            </w:tcBorders>
-            <w:tcMar>
-              <w:top w:type="dxa" w:w="70"/>
-              <w:left w:type="dxa" w:w="110"/>
-              <w:bottom w:type="dxa" w:w="70"/>
-              <w:right w:type="dxa" w:w="110"/>
-            </w:tcMar>
-            <w:vAlign w:val="center"/>
-          </w:tcPr>
-          <w:p>
-            <w:pPr>
-              <w:spacing w:after="20" w:line="276"/>
-              <w:jc w:val="left"/>
-            </w:pPr>
-            <w:r>
-              <w:rPr>
-                <w:b w:val="false"/>
-                <w:bCs w:val="false"/>
-                <w:color w:val="1D2B22"/>
-                <w:sz w:val="18"/>
-                <w:szCs w:val="18"/>
-              </w:rPr>
-              <w:t xml:space="preserve">조난위험 예측</w:t>
-            </w:r>
-          </w:p>
-        </w:tc>
-        <w:tc>
-          <w:tcPr>
-            <w:tcW w:type="dxa" w:w="3300"/>
-            <w:tcBorders>
-              <w:top w:val="single" w:color="C9D8CC" w:sz="2"/>
-              <w:left w:val="single" w:color="C9D8CC" w:sz="2"/>
-              <w:bottom w:val="single" w:color="C9D8CC" w:sz="2"/>
-              <w:right w:val="single" w:color="C9D8CC" w:sz="2"/>
-            </w:tcBorders>
-            <w:tcMar>
-              <w:top w:type="dxa" w:w="70"/>
-              <w:left w:type="dxa" w:w="110"/>
-              <w:bottom w:type="dxa" w:w="70"/>
-              <w:right w:type="dxa" w:w="110"/>
-            </w:tcMar>
-            <w:vAlign w:val="center"/>
-          </w:tcPr>
-          <w:p>
-            <w:pPr>
-              <w:spacing w:after="20" w:line="276"/>
-              <w:jc w:val="left"/>
-            </w:pPr>
-            <w:r>
-              <w:rPr>
-                <w:b w:val="false"/>
-                <w:bCs w:val="false"/>
-                <w:color w:val="1D2B22"/>
-                <w:sz w:val="18"/>
-                <w:szCs w:val="18"/>
-              </w:rPr>
-              <w:t xml:space="preserve">시계열 이상탐지(LSTM-AE)</w:t>
-            </w:r>
-          </w:p>
-        </w:tc>
-        <w:tc>
-          <w:tcPr>
-            <w:tcW w:type="dxa" w:w="4038"/>
-            <w:tcBorders>
-              <w:top w:val="single" w:color="C9D8CC" w:sz="2"/>
-              <w:left w:val="single" w:color="C9D8CC" w:sz="2"/>
-              <w:bottom w:val="single" w:color="C9D8CC" w:sz="2"/>
-              <w:right w:val="single" w:color="C9D8CC" w:sz="2"/>
-            </w:tcBorders>
-            <w:tcMar>
-              <w:top w:type="dxa" w:w="70"/>
-              <w:left w:type="dxa" w:w="110"/>
-              <w:bottom w:type="dxa" w:w="70"/>
-              <w:right w:type="dxa" w:w="110"/>
-            </w:tcMar>
-            <w:vAlign w:val="center"/>
-          </w:tcPr>
-          <w:p>
-            <w:pPr>
-              <w:spacing w:after="20" w:line="276"/>
-              <w:jc w:val="left"/>
-            </w:pPr>
-            <w:r>
-              <w:rPr>
-                <w:b w:val="false"/>
-                <w:bCs w:val="false"/>
-                <w:color w:val="1D2B22"/>
-                <w:sz w:val="18"/>
-                <w:szCs w:val="18"/>
-              </w:rPr>
-              <w:t xml:space="preserve">GPS 궤적·정지시간·심박 → 조난 의심 스코어</w:t>
-            </w:r>
-          </w:p>
-        </w:tc>
-      </w:tr>
-      <w:tr>
-        <w:tc>
-          <w:tcPr>
-            <w:tcW w:type="dxa" w:w="2300"/>
-            <w:tcBorders>
-              <w:top w:val="single" w:color="C9D8CC" w:sz="2"/>
-              <w:left w:val="single" w:color="C9D8CC" w:sz="2"/>
-              <w:bottom w:val="single" w:color="C9D8CC" w:sz="2"/>
-              <w:right w:val="single" w:color="C9D8CC" w:sz="2"/>
-            </w:tcBorders>
-            <w:tcMar>
-              <w:top w:type="dxa" w:w="70"/>
-              <w:left w:type="dxa" w:w="110"/>
-              <w:bottom w:type="dxa" w:w="70"/>
-              <w:right w:type="dxa" w:w="110"/>
-            </w:tcMar>
-            <w:vAlign w:val="center"/>
-          </w:tcPr>
-          <w:p>
-            <w:pPr>
-              <w:spacing w:after="20" w:line="276"/>
-              <w:jc w:val="left"/>
-            </w:pPr>
-            <w:r>
-              <w:rPr>
-                <w:b w:val="false"/>
-                <w:bCs w:val="false"/>
-                <w:color w:val="1D2B22"/>
-                <w:sz w:val="18"/>
-                <w:szCs w:val="18"/>
-              </w:rPr>
-              <w:t xml:space="preserve">위험도 융합 스코어</w:t>
-            </w:r>
-          </w:p>
-        </w:tc>
-        <w:tc>
-          <w:tcPr>
-            <w:tcW w:type="dxa" w:w="3300"/>
-            <w:tcBorders>
-              <w:top w:val="single" w:color="C9D8CC" w:sz="2"/>
-              <w:left w:val="single" w:color="C9D8CC" w:sz="2"/>
-              <w:bottom w:val="single" w:color="C9D8CC" w:sz="2"/>
-              <w:right w:val="single" w:color="C9D8CC" w:sz="2"/>
-            </w:tcBorders>
-            <w:tcMar>
-              <w:top w:type="dxa" w:w="70"/>
-              <w:left w:type="dxa" w:w="110"/>
-              <w:bottom w:type="dxa" w:w="70"/>
-              <w:right w:type="dxa" w:w="110"/>
-            </w:tcMar>
-            <w:vAlign w:val="center"/>
-          </w:tcPr>
-          <w:p>
-            <w:pPr>
-              <w:spacing w:after="20" w:line="276"/>
-              <w:jc w:val="left"/>
-            </w:pPr>
-            <w:r>
-              <w:rPr>
-                <w:b w:val="false"/>
-                <w:bCs w:val="false"/>
-                <w:color w:val="1D2B22"/>
-                <w:sz w:val="18"/>
-                <w:szCs w:val="18"/>
-              </w:rPr>
-              <w:t xml:space="preserve">XGBoost 회귀</w:t>
-            </w:r>
-          </w:p>
-        </w:tc>
-        <w:tc>
-          <w:tcPr>
-            <w:tcW w:type="dxa" w:w="4038"/>
-            <w:tcBorders>
-              <w:top w:val="single" w:color="C9D8CC" w:sz="2"/>
-              <w:left w:val="single" w:color="C9D8CC" w:sz="2"/>
-              <w:bottom w:val="single" w:color="C9D8CC" w:sz="2"/>
-              <w:right w:val="single" w:color="C9D8CC" w:sz="2"/>
-            </w:tcBorders>
-            <w:tcMar>
-              <w:top w:type="dxa" w:w="70"/>
-              <w:left w:type="dxa" w:w="110"/>
-              <w:bottom w:type="dxa" w:w="70"/>
-              <w:right w:type="dxa" w:w="110"/>
-            </w:tcMar>
-            <w:vAlign w:val="center"/>
-          </w:tcPr>
-          <w:p>
-            <w:pPr>
-              <w:spacing w:after="20" w:line="276"/>
-              <w:jc w:val="left"/>
-            </w:pPr>
-            <w:r>
-              <w:rPr>
-                <w:b w:val="false"/>
-                <w:bCs w:val="false"/>
-                <w:color w:val="1D2B22"/>
-                <w:sz w:val="18"/>
-                <w:szCs w:val="18"/>
-              </w:rPr>
-              <w:t xml:space="preserve">산사태등급·실측기상·사고이력·강우 → 구간 위험도 0~100</w:t>
-            </w:r>
-          </w:p>
-        </w:tc>
-      </w:tr>
-      <w:tr>
-        <w:tc>
-          <w:tcPr>
-            <w:tcW w:type="dxa" w:w="2300"/>
-            <w:tcBorders>
-              <w:top w:val="single" w:color="C9D8CC" w:sz="2"/>
-              <w:left w:val="single" w:color="C9D8CC" w:sz="2"/>
-              <w:bottom w:val="single" w:color="C9D8CC" w:sz="2"/>
-              <w:right w:val="single" w:color="C9D8CC" w:sz="2"/>
-            </w:tcBorders>
-            <w:tcMar>
-              <w:top w:type="dxa" w:w="70"/>
-              <w:left w:type="dxa" w:w="110"/>
-              <w:bottom w:type="dxa" w:w="70"/>
-              <w:right w:type="dxa" w:w="110"/>
-            </w:tcMar>
-            <w:vAlign w:val="center"/>
-          </w:tcPr>
-          <w:p>
-            <w:pPr>
-              <w:spacing w:after="20" w:line="276"/>
-              <w:jc w:val="left"/>
-            </w:pPr>
-            <w:r>
-              <w:rPr>
-                <w:b w:val="false"/>
-                <w:bCs w:val="false"/>
-                <w:color w:val="1D2B22"/>
-                <w:sz w:val="18"/>
-                <w:szCs w:val="18"/>
-              </w:rPr>
-              <w:t xml:space="preserve">식물·독버섯 판별</w:t>
-            </w:r>
-          </w:p>
-        </w:tc>
-        <w:tc>
-          <w:tcPr>
-            <w:tcW w:type="dxa" w:w="3300"/>
-            <w:tcBorders>
-              <w:top w:val="single" w:color="C9D8CC" w:sz="2"/>
-              <w:left w:val="single" w:color="C9D8CC" w:sz="2"/>
-              <w:bottom w:val="single" w:color="C9D8CC" w:sz="2"/>
-              <w:right w:val="single" w:color="C9D8CC" w:sz="2"/>
-            </w:tcBorders>
-            <w:tcMar>
-              <w:top w:type="dxa" w:w="70"/>
-              <w:left w:type="dxa" w:w="110"/>
-              <w:bottom w:type="dxa" w:w="70"/>
-              <w:right w:type="dxa" w:w="110"/>
-            </w:tcMar>
-            <w:vAlign w:val="center"/>
-          </w:tcPr>
-          <w:p>
-            <w:pPr>
-              <w:spacing w:after="20" w:line="276"/>
-              <w:jc w:val="left"/>
-            </w:pPr>
-            <w:r>
-              <w:rPr>
-                <w:b w:val="false"/>
-                <w:bCs w:val="false"/>
-                <w:color w:val="1D2B22"/>
-                <w:sz w:val="18"/>
-                <w:szCs w:val="18"/>
-              </w:rPr>
-              <w:t xml:space="preserve">EfficientNet 경량화(온디바이스)</w:t>
-            </w:r>
-          </w:p>
-        </w:tc>
-        <w:tc>
-          <w:tcPr>
-            <w:tcW w:type="dxa" w:w="4038"/>
-            <w:tcBorders>
-              <w:top w:val="single" w:color="C9D8CC" w:sz="2"/>
-              <w:left w:val="single" w:color="C9D8CC" w:sz="2"/>
-              <w:bottom w:val="single" w:color="C9D8CC" w:sz="2"/>
-              <w:right w:val="single" w:color="C9D8CC" w:sz="2"/>
-            </w:tcBorders>
-            <w:tcMar>
-              <w:top w:type="dxa" w:w="70"/>
-              <w:left w:type="dxa" w:w="110"/>
-              <w:bottom w:type="dxa" w:w="70"/>
-              <w:right w:type="dxa" w:w="110"/>
-            </w:tcMar>
-            <w:vAlign w:val="center"/>
-          </w:tcPr>
-          <w:p>
-            <w:pPr>
-              <w:spacing w:after="20" w:line="276"/>
-              <w:jc w:val="left"/>
-            </w:pPr>
-            <w:r>
-              <w:rPr>
-                <w:b w:val="false"/>
-                <w:bCs w:val="false"/>
-                <w:color w:val="1D2B22"/>
-                <w:sz w:val="18"/>
-                <w:szCs w:val="18"/>
-              </w:rPr>
-              <w:t xml:space="preserve">사진 → 종 분류 + 독성 경고(신뢰도)</w:t>
-            </w:r>
-          </w:p>
-        </w:tc>
-      </w:tr>
-      <w:tr>
-        <w:tc>
-          <w:tcPr>
-            <w:tcW w:type="dxa" w:w="2300"/>
-            <w:tcBorders>
-              <w:top w:val="single" w:color="C9D8CC" w:sz="2"/>
-              <w:left w:val="single" w:color="C9D8CC" w:sz="2"/>
-              <w:bottom w:val="single" w:color="C9D8CC" w:sz="2"/>
-              <w:right w:val="single" w:color="C9D8CC" w:sz="2"/>
-            </w:tcBorders>
-            <w:tcMar>
-              <w:top w:type="dxa" w:w="70"/>
-              <w:left w:type="dxa" w:w="110"/>
-              <w:bottom w:type="dxa" w:w="70"/>
-              <w:right w:type="dxa" w:w="110"/>
-            </w:tcMar>
-            <w:vAlign w:val="center"/>
-          </w:tcPr>
-          <w:p>
-            <w:pPr>
-              <w:spacing w:after="20" w:line="276"/>
-              <w:jc w:val="left"/>
-            </w:pPr>
-            <w:r>
-              <w:rPr>
-                <w:b w:val="false"/>
-                <w:bCs w:val="false"/>
-                <w:color w:val="1D2B22"/>
-                <w:sz w:val="18"/>
-                <w:szCs w:val="18"/>
-              </w:rPr>
-              <w:t xml:space="preserve">숲해설 LLM ‘숲이’</w:t>
-            </w:r>
-          </w:p>
-        </w:tc>
-        <w:tc>
-          <w:tcPr>
-            <w:tcW w:type="dxa" w:w="3300"/>
-            <w:tcBorders>
-              <w:top w:val="single" w:color="C9D8CC" w:sz="2"/>
-              <w:left w:val="single" w:color="C9D8CC" w:sz="2"/>
-              <w:bottom w:val="single" w:color="C9D8CC" w:sz="2"/>
-              <w:right w:val="single" w:color="C9D8CC" w:sz="2"/>
-            </w:tcBorders>
-            <w:tcMar>
-              <w:top w:type="dxa" w:w="70"/>
-              <w:left w:type="dxa" w:w="110"/>
-              <w:bottom w:type="dxa" w:w="70"/>
-              <w:right w:type="dxa" w:w="110"/>
-            </w:tcMar>
-            <w:vAlign w:val="center"/>
-          </w:tcPr>
-          <w:p>
-            <w:pPr>
-              <w:spacing w:after="20" w:line="276"/>
-              <w:jc w:val="left"/>
-            </w:pPr>
-            <w:r>
-              <w:rPr>
-                <w:b w:val="false"/>
-                <w:bCs w:val="false"/>
-                <w:color w:val="1D2B22"/>
-                <w:sz w:val="18"/>
-                <w:szCs w:val="18"/>
-              </w:rPr>
-              <w:t xml:space="preserve">한국어 sLLM + RAG</w:t>
-            </w:r>
-          </w:p>
-        </w:tc>
-        <w:tc>
-          <w:tcPr>
-            <w:tcW w:type="dxa" w:w="4038"/>
-            <w:tcBorders>
-              <w:top w:val="single" w:color="C9D8CC" w:sz="2"/>
-              <w:left w:val="single" w:color="C9D8CC" w:sz="2"/>
-              <w:bottom w:val="single" w:color="C9D8CC" w:sz="2"/>
-              <w:right w:val="single" w:color="C9D8CC" w:sz="2"/>
-            </w:tcBorders>
-            <w:tcMar>
-              <w:top w:type="dxa" w:w="70"/>
-              <w:left w:type="dxa" w:w="110"/>
-              <w:bottom w:type="dxa" w:w="70"/>
-              <w:right w:type="dxa" w:w="110"/>
-            </w:tcMar>
-            <w:vAlign w:val="center"/>
-          </w:tcPr>
-          <w:p>
-            <w:pPr>
-              <w:spacing w:after="20" w:line="276"/>
-              <w:jc w:val="left"/>
-            </w:pPr>
-            <w:r>
-              <w:rPr>
-                <w:b w:val="false"/>
-                <w:bCs w:val="false"/>
-                <w:color w:val="1D2B22"/>
-                <w:sz w:val="18"/>
-                <w:szCs w:val="18"/>
-              </w:rPr>
-              <w:t xml:space="preserve">질문·위치 → 공공 지식베이스 근거 답변(4개 언어)</w:t>
-            </w:r>
-          </w:p>
-        </w:tc>
-      </w:tr>
-    </w:tbl>
-    <w:p>
-      <w:pPr>
-        <w:pStyle w:val="Heading2"/>
-        <w:spacing w:after="120" w:before="240"/>
+    <w:p>
+      <w:pPr>
+        <w:spacing w:after="160" w:before="0"/>
+        <w:jc w:val="center"/>
       </w:pPr>
       <w:r>
         <w:rPr>
           <w:b/>
           <w:bCs/>
           <w:color w:val="2D6A4F"/>
-        </w:rPr>
-        <w:t xml:space="preserve">4-4. 시연 시나리오 (발표평가 시연 순서)</w:t>
-      </w:r>
-    </w:p>
-    <w:tbl>
-      <w:tblPr>
-        <w:tblW w:type="dxa" w:w="9638"/>
-        <w:tblBorders>
-          <w:top w:val="single" w:color="auto" w:sz="4"/>
-          <w:left w:val="single" w:color="auto" w:sz="4"/>
-          <w:bottom w:val="single" w:color="auto" w:sz="4"/>
-          <w:right w:val="single" w:color="auto" w:sz="4"/>
-          <w:insideH w:val="single" w:color="auto" w:sz="4"/>
-          <w:insideV w:val="single" w:color="auto" w:sz="4"/>
-        </w:tblBorders>
-      </w:tblPr>
-      <w:tblGrid>
-        <w:gridCol w:w="900"/>
-        <w:gridCol w:w="2900"/>
-        <w:gridCol w:w="5838"/>
-      </w:tblGrid>
-      <w:tr>
-        <w:trPr>
-          <w:tblHeader/>
-        </w:trPr>
-        <w:tc>
-          <w:tcPr>
-            <w:tcW w:type="dxa" w:w="900"/>
-            <w:tcBorders>
-              <w:top w:val="single" w:color="C9D8CC" w:sz="2"/>
-              <w:left w:val="single" w:color="C9D8CC" w:sz="2"/>
-              <w:bottom w:val="single" w:color="C9D8CC" w:sz="2"/>
-              <w:right w:val="single" w:color="C9D8CC" w:sz="2"/>
-            </w:tcBorders>
-            <w:shd w:fill="1B4332" w:val="clear"/>
-            <w:tcMar>
-              <w:top w:type="dxa" w:w="70"/>
-              <w:left w:type="dxa" w:w="110"/>
-              <w:bottom w:type="dxa" w:w="70"/>
-              <w:right w:type="dxa" w:w="110"/>
-            </w:tcMar>
-            <w:vAlign w:val="center"/>
-          </w:tcPr>
-          <w:p>
-            <w:pPr>
-              <w:spacing w:after="20" w:line="276"/>
-              <w:jc w:val="center"/>
-            </w:pPr>
-            <w:r>
-              <w:rPr>
-                <w:b/>
-                <w:bCs/>
-                <w:color w:val="FFFFFF"/>
-                <w:sz w:val="18"/>
-                <w:szCs w:val="18"/>
-              </w:rPr>
-              <w:t xml:space="preserve">순서</w:t>
-            </w:r>
-          </w:p>
-        </w:tc>
-        <w:tc>
-          <w:tcPr>
-            <w:tcW w:type="dxa" w:w="2900"/>
-            <w:tcBorders>
-              <w:top w:val="single" w:color="C9D8CC" w:sz="2"/>
-              <w:left w:val="single" w:color="C9D8CC" w:sz="2"/>
-              <w:bottom w:val="single" w:color="C9D8CC" w:sz="2"/>
-              <w:right w:val="single" w:color="C9D8CC" w:sz="2"/>
-            </w:tcBorders>
-            <w:shd w:fill="1B4332" w:val="clear"/>
-            <w:tcMar>
-              <w:top w:type="dxa" w:w="70"/>
-              <w:left w:type="dxa" w:w="110"/>
-              <w:bottom w:type="dxa" w:w="70"/>
-              <w:right w:type="dxa" w:w="110"/>
-            </w:tcMar>
-            <w:vAlign w:val="center"/>
-          </w:tcPr>
-          <w:p>
-            <w:pPr>
-              <w:spacing w:after="20" w:line="276"/>
-              <w:jc w:val="center"/>
-            </w:pPr>
-            <w:r>
-              <w:rPr>
-                <w:b/>
-                <w:bCs/>
-                <w:color w:val="FFFFFF"/>
-                <w:sz w:val="18"/>
-                <w:szCs w:val="18"/>
-              </w:rPr>
-              <w:t xml:space="preserve">화면</w:t>
-            </w:r>
-          </w:p>
-        </w:tc>
-        <w:tc>
-          <w:tcPr>
-            <w:tcW w:type="dxa" w:w="5838"/>
-            <w:tcBorders>
-              <w:top w:val="single" w:color="C9D8CC" w:sz="2"/>
-              <w:left w:val="single" w:color="C9D8CC" w:sz="2"/>
-              <w:bottom w:val="single" w:color="C9D8CC" w:sz="2"/>
-              <w:right w:val="single" w:color="C9D8CC" w:sz="2"/>
-            </w:tcBorders>
-            <w:shd w:fill="1B4332" w:val="clear"/>
-            <w:tcMar>
-              <w:top w:type="dxa" w:w="70"/>
-              <w:left w:type="dxa" w:w="110"/>
-              <w:bottom w:type="dxa" w:w="70"/>
-              <w:right w:type="dxa" w:w="110"/>
-            </w:tcMar>
-            <w:vAlign w:val="center"/>
-          </w:tcPr>
-          <w:p>
-            <w:pPr>
-              <w:spacing w:after="20" w:line="276"/>
-              <w:jc w:val="center"/>
-            </w:pPr>
-            <w:r>
-              <w:rPr>
-                <w:b/>
-                <w:bCs/>
-                <w:color w:val="FFFFFF"/>
-                <w:sz w:val="18"/>
-                <w:szCs w:val="18"/>
-              </w:rPr>
-              <w:t xml:space="preserve">시연 내용</w:t>
-            </w:r>
-          </w:p>
-        </w:tc>
-      </w:tr>
-      <w:tr>
-        <w:tc>
-          <w:tcPr>
-            <w:tcW w:type="dxa" w:w="900"/>
-            <w:tcBorders>
-              <w:top w:val="single" w:color="C9D8CC" w:sz="2"/>
-              <w:left w:val="single" w:color="C9D8CC" w:sz="2"/>
-              <w:bottom w:val="single" w:color="C9D8CC" w:sz="2"/>
-              <w:right w:val="single" w:color="C9D8CC" w:sz="2"/>
-            </w:tcBorders>
-            <w:tcMar>
-              <w:top w:type="dxa" w:w="70"/>
-              <w:left w:type="dxa" w:w="110"/>
-              <w:bottom w:type="dxa" w:w="70"/>
-              <w:right w:type="dxa" w:w="110"/>
-            </w:tcMar>
-            <w:vAlign w:val="center"/>
-          </w:tcPr>
-          <w:p>
-            <w:pPr>
-              <w:spacing w:after="20" w:line="276"/>
-              <w:jc w:val="left"/>
-            </w:pPr>
-            <w:r>
-              <w:rPr>
-                <w:b w:val="false"/>
-                <w:bCs w:val="false"/>
-                <w:color w:val="1D2B22"/>
-                <w:sz w:val="18"/>
-                <w:szCs w:val="18"/>
-              </w:rPr>
-              <w:t xml:space="preserve">1</w:t>
-            </w:r>
-          </w:p>
-        </w:tc>
-        <w:tc>
-          <w:tcPr>
-            <w:tcW w:type="dxa" w:w="2900"/>
-            <w:tcBorders>
-              <w:top w:val="single" w:color="C9D8CC" w:sz="2"/>
-              <w:left w:val="single" w:color="C9D8CC" w:sz="2"/>
-              <w:bottom w:val="single" w:color="C9D8CC" w:sz="2"/>
-              <w:right w:val="single" w:color="C9D8CC" w:sz="2"/>
-            </w:tcBorders>
-            <w:tcMar>
-              <w:top w:type="dxa" w:w="70"/>
-              <w:left w:type="dxa" w:w="110"/>
-              <w:bottom w:type="dxa" w:w="70"/>
-              <w:right w:type="dxa" w:w="110"/>
-            </w:tcMar>
-            <w:vAlign w:val="center"/>
-          </w:tcPr>
-          <w:p>
-            <w:pPr>
-              <w:spacing w:after="20" w:line="276"/>
-              <w:jc w:val="left"/>
-            </w:pPr>
-            <w:r>
-              <w:rPr>
-                <w:b w:val="false"/>
-                <w:bCs w:val="false"/>
-                <w:color w:val="1D2B22"/>
-                <w:sz w:val="18"/>
-                <w:szCs w:val="18"/>
-              </w:rPr>
-              <w:t xml:space="preserve">홈</w:t>
-            </w:r>
-          </w:p>
-        </w:tc>
-        <w:tc>
-          <w:tcPr>
-            <w:tcW w:type="dxa" w:w="5838"/>
-            <w:tcBorders>
-              <w:top w:val="single" w:color="C9D8CC" w:sz="2"/>
-              <w:left w:val="single" w:color="C9D8CC" w:sz="2"/>
-              <w:bottom w:val="single" w:color="C9D8CC" w:sz="2"/>
-              <w:right w:val="single" w:color="C9D8CC" w:sz="2"/>
-            </w:tcBorders>
-            <w:tcMar>
-              <w:top w:type="dxa" w:w="70"/>
-              <w:left w:type="dxa" w:w="110"/>
-              <w:bottom w:type="dxa" w:w="70"/>
-              <w:right w:type="dxa" w:w="110"/>
-            </w:tcMar>
-            <w:vAlign w:val="center"/>
-          </w:tcPr>
-          <w:p>
-            <w:pPr>
-              <w:spacing w:after="20" w:line="276"/>
-              <w:jc w:val="left"/>
-            </w:pPr>
-            <w:r>
-              <w:rPr>
-                <w:b w:val="false"/>
-                <w:bCs w:val="false"/>
-                <w:color w:val="1D2B22"/>
-                <w:sz w:val="18"/>
-                <w:szCs w:val="18"/>
-              </w:rPr>
-              <w:t xml:space="preserve">오늘의 산행지수 82점 — 산불위험·산사태·산악기상·일몰 4개 공공데이터가 한 점수로 융합되는 과정 설명</w:t>
-            </w:r>
-          </w:p>
-        </w:tc>
-      </w:tr>
-      <w:tr>
-        <w:tc>
-          <w:tcPr>
-            <w:tcW w:type="dxa" w:w="900"/>
-            <w:tcBorders>
-              <w:top w:val="single" w:color="C9D8CC" w:sz="2"/>
-              <w:left w:val="single" w:color="C9D8CC" w:sz="2"/>
-              <w:bottom w:val="single" w:color="C9D8CC" w:sz="2"/>
-              <w:right w:val="single" w:color="C9D8CC" w:sz="2"/>
-            </w:tcBorders>
-            <w:tcMar>
-              <w:top w:type="dxa" w:w="70"/>
-              <w:left w:type="dxa" w:w="110"/>
-              <w:bottom w:type="dxa" w:w="70"/>
-              <w:right w:type="dxa" w:w="110"/>
-            </w:tcMar>
-            <w:vAlign w:val="center"/>
-          </w:tcPr>
-          <w:p>
-            <w:pPr>
-              <w:spacing w:after="20" w:line="276"/>
-              <w:jc w:val="left"/>
-            </w:pPr>
-            <w:r>
-              <w:rPr>
-                <w:b w:val="false"/>
-                <w:bCs w:val="false"/>
-                <w:color w:val="1D2B22"/>
-                <w:sz w:val="18"/>
-                <w:szCs w:val="18"/>
-              </w:rPr>
-              <w:t xml:space="preserve">2</w:t>
-            </w:r>
-          </w:p>
-        </w:tc>
-        <w:tc>
-          <w:tcPr>
-            <w:tcW w:type="dxa" w:w="2900"/>
-            <w:tcBorders>
-              <w:top w:val="single" w:color="C9D8CC" w:sz="2"/>
-              <w:left w:val="single" w:color="C9D8CC" w:sz="2"/>
-              <w:bottom w:val="single" w:color="C9D8CC" w:sz="2"/>
-              <w:right w:val="single" w:color="C9D8CC" w:sz="2"/>
-            </w:tcBorders>
-            <w:tcMar>
-              <w:top w:type="dxa" w:w="70"/>
-              <w:left w:type="dxa" w:w="110"/>
-              <w:bottom w:type="dxa" w:w="70"/>
-              <w:right w:type="dxa" w:w="110"/>
-            </w:tcMar>
-            <w:vAlign w:val="center"/>
-          </w:tcPr>
-          <w:p>
-            <w:pPr>
-              <w:spacing w:after="20" w:line="276"/>
-              <w:jc w:val="left"/>
-            </w:pPr>
-            <w:r>
-              <w:rPr>
-                <w:b w:val="false"/>
-                <w:bCs w:val="false"/>
-                <w:color w:val="1D2B22"/>
-                <w:sz w:val="18"/>
-                <w:szCs w:val="18"/>
-              </w:rPr>
-              <w:t xml:space="preserve">홈 → AI 추천</w:t>
-            </w:r>
-          </w:p>
-        </w:tc>
-        <w:tc>
-          <w:tcPr>
-            <w:tcW w:type="dxa" w:w="5838"/>
-            <w:tcBorders>
-              <w:top w:val="single" w:color="C9D8CC" w:sz="2"/>
-              <w:left w:val="single" w:color="C9D8CC" w:sz="2"/>
-              <w:bottom w:val="single" w:color="C9D8CC" w:sz="2"/>
-              <w:right w:val="single" w:color="C9D8CC" w:sz="2"/>
-            </w:tcBorders>
-            <w:tcMar>
-              <w:top w:type="dxa" w:w="70"/>
-              <w:left w:type="dxa" w:w="110"/>
-              <w:bottom w:type="dxa" w:w="70"/>
-              <w:right w:type="dxa" w:w="110"/>
-            </w:tcMar>
-            <w:vAlign w:val="center"/>
-          </w:tcPr>
-          <w:p>
-            <w:pPr>
-              <w:spacing w:after="20" w:line="276"/>
-              <w:jc w:val="left"/>
-            </w:pPr>
-            <w:r>
-              <w:rPr>
-                <w:b w:val="false"/>
-                <w:bCs w:val="false"/>
-                <w:color w:val="1D2B22"/>
-                <w:sz w:val="18"/>
-                <w:szCs w:val="18"/>
-              </w:rPr>
-              <w:t xml:space="preserve">사용자 체력(중급)·무릎 주의 이력을 반영한 북한산 백운대 코스 매칭 92% 확인</w:t>
-            </w:r>
-          </w:p>
-        </w:tc>
-      </w:tr>
-      <w:tr>
-        <w:tc>
-          <w:tcPr>
-            <w:tcW w:type="dxa" w:w="900"/>
-            <w:tcBorders>
-              <w:top w:val="single" w:color="C9D8CC" w:sz="2"/>
-              <w:left w:val="single" w:color="C9D8CC" w:sz="2"/>
-              <w:bottom w:val="single" w:color="C9D8CC" w:sz="2"/>
-              <w:right w:val="single" w:color="C9D8CC" w:sz="2"/>
-            </w:tcBorders>
-            <w:tcMar>
-              <w:top w:type="dxa" w:w="70"/>
-              <w:left w:type="dxa" w:w="110"/>
-              <w:bottom w:type="dxa" w:w="70"/>
-              <w:right w:type="dxa" w:w="110"/>
-            </w:tcMar>
-            <w:vAlign w:val="center"/>
-          </w:tcPr>
-          <w:p>
-            <w:pPr>
-              <w:spacing w:after="20" w:line="276"/>
-              <w:jc w:val="left"/>
-            </w:pPr>
-            <w:r>
-              <w:rPr>
-                <w:b w:val="false"/>
-                <w:bCs w:val="false"/>
-                <w:color w:val="1D2B22"/>
-                <w:sz w:val="18"/>
-                <w:szCs w:val="18"/>
-              </w:rPr>
-              <w:t xml:space="preserve">3</w:t>
-            </w:r>
-          </w:p>
-        </w:tc>
-        <w:tc>
-          <w:tcPr>
-            <w:tcW w:type="dxa" w:w="2900"/>
-            <w:tcBorders>
-              <w:top w:val="single" w:color="C9D8CC" w:sz="2"/>
-              <w:left w:val="single" w:color="C9D8CC" w:sz="2"/>
-              <w:bottom w:val="single" w:color="C9D8CC" w:sz="2"/>
-              <w:right w:val="single" w:color="C9D8CC" w:sz="2"/>
-            </w:tcBorders>
-            <w:tcMar>
-              <w:top w:type="dxa" w:w="70"/>
-              <w:left w:type="dxa" w:w="110"/>
-              <w:bottom w:type="dxa" w:w="70"/>
-              <w:right w:type="dxa" w:w="110"/>
-            </w:tcMar>
-            <w:vAlign w:val="center"/>
-          </w:tcPr>
-          <w:p>
-            <w:pPr>
-              <w:spacing w:after="20" w:line="276"/>
-              <w:jc w:val="left"/>
-            </w:pPr>
-            <w:r>
-              <w:rPr>
-                <w:b w:val="false"/>
-                <w:bCs w:val="false"/>
-                <w:color w:val="1D2B22"/>
-                <w:sz w:val="18"/>
-                <w:szCs w:val="18"/>
-              </w:rPr>
-              <w:t xml:space="preserve">산행 모드</w:t>
-            </w:r>
-          </w:p>
-        </w:tc>
-        <w:tc>
-          <w:tcPr>
-            <w:tcW w:type="dxa" w:w="5838"/>
-            <w:tcBorders>
-              <w:top w:val="single" w:color="C9D8CC" w:sz="2"/>
-              <w:left w:val="single" w:color="C9D8CC" w:sz="2"/>
-              <w:bottom w:val="single" w:color="C9D8CC" w:sz="2"/>
-              <w:right w:val="single" w:color="C9D8CC" w:sz="2"/>
-            </w:tcBorders>
-            <w:tcMar>
-              <w:top w:type="dxa" w:w="70"/>
-              <w:left w:type="dxa" w:w="110"/>
-              <w:bottom w:type="dxa" w:w="70"/>
-              <w:right w:type="dxa" w:w="110"/>
-            </w:tcMar>
-            <w:vAlign w:val="center"/>
-          </w:tcPr>
-          <w:p>
-            <w:pPr>
-              <w:spacing w:after="20" w:line="276"/>
-              <w:jc w:val="left"/>
-            </w:pPr>
-            <w:r>
-              <w:rPr>
-                <w:b w:val="false"/>
-                <w:bCs w:val="false"/>
-                <w:color w:val="1D2B22"/>
-                <w:sz w:val="18"/>
-                <w:szCs w:val="18"/>
-              </w:rPr>
-              <w:t xml:space="preserve">등산로 위 실시간 위치·국가지점번호 표시, 300m 앞 낙석 구간 경고 푸시 수신</w:t>
-            </w:r>
-          </w:p>
-        </w:tc>
-      </w:tr>
-      <w:tr>
-        <w:tc>
-          <w:tcPr>
-            <w:tcW w:type="dxa" w:w="900"/>
-            <w:tcBorders>
-              <w:top w:val="single" w:color="C9D8CC" w:sz="2"/>
-              <w:left w:val="single" w:color="C9D8CC" w:sz="2"/>
-              <w:bottom w:val="single" w:color="C9D8CC" w:sz="2"/>
-              <w:right w:val="single" w:color="C9D8CC" w:sz="2"/>
-            </w:tcBorders>
-            <w:tcMar>
-              <w:top w:type="dxa" w:w="70"/>
-              <w:left w:type="dxa" w:w="110"/>
-              <w:bottom w:type="dxa" w:w="70"/>
-              <w:right w:type="dxa" w:w="110"/>
-            </w:tcMar>
-            <w:vAlign w:val="center"/>
-          </w:tcPr>
-          <w:p>
-            <w:pPr>
-              <w:spacing w:after="20" w:line="276"/>
-              <w:jc w:val="left"/>
-            </w:pPr>
-            <w:r>
-              <w:rPr>
-                <w:b w:val="false"/>
-                <w:bCs w:val="false"/>
-                <w:color w:val="1D2B22"/>
-                <w:sz w:val="18"/>
-                <w:szCs w:val="18"/>
-              </w:rPr>
-              <w:t xml:space="preserve">4</w:t>
-            </w:r>
-          </w:p>
-        </w:tc>
-        <w:tc>
-          <w:tcPr>
-            <w:tcW w:type="dxa" w:w="2900"/>
-            <w:tcBorders>
-              <w:top w:val="single" w:color="C9D8CC" w:sz="2"/>
-              <w:left w:val="single" w:color="C9D8CC" w:sz="2"/>
-              <w:bottom w:val="single" w:color="C9D8CC" w:sz="2"/>
-              <w:right w:val="single" w:color="C9D8CC" w:sz="2"/>
-            </w:tcBorders>
-            <w:tcMar>
-              <w:top w:type="dxa" w:w="70"/>
-              <w:left w:type="dxa" w:w="110"/>
-              <w:bottom w:type="dxa" w:w="70"/>
-              <w:right w:type="dxa" w:w="110"/>
-            </w:tcMar>
-            <w:vAlign w:val="center"/>
-          </w:tcPr>
-          <w:p>
-            <w:pPr>
-              <w:spacing w:after="20" w:line="276"/>
-              <w:jc w:val="left"/>
-            </w:pPr>
-            <w:r>
-              <w:rPr>
-                <w:b w:val="false"/>
-                <w:bCs w:val="false"/>
-                <w:color w:val="1D2B22"/>
-                <w:sz w:val="18"/>
-                <w:szCs w:val="18"/>
-              </w:rPr>
-              <w:t xml:space="preserve">AI동무</w:t>
-            </w:r>
-          </w:p>
-        </w:tc>
-        <w:tc>
-          <w:tcPr>
-            <w:tcW w:type="dxa" w:w="5838"/>
-            <w:tcBorders>
-              <w:top w:val="single" w:color="C9D8CC" w:sz="2"/>
-              <w:left w:val="single" w:color="C9D8CC" w:sz="2"/>
-              <w:bottom w:val="single" w:color="C9D8CC" w:sz="2"/>
-              <w:right w:val="single" w:color="C9D8CC" w:sz="2"/>
-            </w:tcBorders>
-            <w:tcMar>
-              <w:top w:type="dxa" w:w="70"/>
-              <w:left w:type="dxa" w:w="110"/>
-              <w:bottom w:type="dxa" w:w="70"/>
-              <w:right w:type="dxa" w:w="110"/>
-            </w:tcMar>
-            <w:vAlign w:val="center"/>
-          </w:tcPr>
-          <w:p>
-            <w:pPr>
-              <w:spacing w:after="20" w:line="276"/>
-              <w:jc w:val="left"/>
-            </w:pPr>
-            <w:r>
-              <w:rPr>
-                <w:b w:val="false"/>
-                <w:bCs w:val="false"/>
-                <w:color w:val="1D2B22"/>
-                <w:sz w:val="18"/>
-                <w:szCs w:val="18"/>
-              </w:rPr>
-              <w:t xml:space="preserve">버섯 사진 촬영 → 개나리광대버섯(맹독성) 87% 경고 — 비행기모드(오프라인)에서 재시연</w:t>
-            </w:r>
-          </w:p>
-        </w:tc>
-      </w:tr>
-      <w:tr>
-        <w:tc>
-          <w:tcPr>
-            <w:tcW w:type="dxa" w:w="900"/>
-            <w:tcBorders>
-              <w:top w:val="single" w:color="C9D8CC" w:sz="2"/>
-              <w:left w:val="single" w:color="C9D8CC" w:sz="2"/>
-              <w:bottom w:val="single" w:color="C9D8CC" w:sz="2"/>
-              <w:right w:val="single" w:color="C9D8CC" w:sz="2"/>
-            </w:tcBorders>
-            <w:tcMar>
-              <w:top w:type="dxa" w:w="70"/>
-              <w:left w:type="dxa" w:w="110"/>
-              <w:bottom w:type="dxa" w:w="70"/>
-              <w:right w:type="dxa" w:w="110"/>
-            </w:tcMar>
-            <w:vAlign w:val="center"/>
-          </w:tcPr>
-          <w:p>
-            <w:pPr>
-              <w:spacing w:after="20" w:line="276"/>
-              <w:jc w:val="left"/>
-            </w:pPr>
-            <w:r>
-              <w:rPr>
-                <w:b w:val="false"/>
-                <w:bCs w:val="false"/>
-                <w:color w:val="1D2B22"/>
-                <w:sz w:val="18"/>
-                <w:szCs w:val="18"/>
-              </w:rPr>
-              <w:t xml:space="preserve">5</w:t>
-            </w:r>
-          </w:p>
-        </w:tc>
-        <w:tc>
-          <w:tcPr>
-            <w:tcW w:type="dxa" w:w="2900"/>
-            <w:tcBorders>
-              <w:top w:val="single" w:color="C9D8CC" w:sz="2"/>
-              <w:left w:val="single" w:color="C9D8CC" w:sz="2"/>
-              <w:bottom w:val="single" w:color="C9D8CC" w:sz="2"/>
-              <w:right w:val="single" w:color="C9D8CC" w:sz="2"/>
-            </w:tcBorders>
-            <w:tcMar>
-              <w:top w:type="dxa" w:w="70"/>
-              <w:left w:type="dxa" w:w="110"/>
-              <w:bottom w:type="dxa" w:w="70"/>
-              <w:right w:type="dxa" w:w="110"/>
-            </w:tcMar>
-            <w:vAlign w:val="center"/>
-          </w:tcPr>
-          <w:p>
-            <w:pPr>
-              <w:spacing w:after="20" w:line="276"/>
-              <w:jc w:val="left"/>
-            </w:pPr>
-            <w:r>
-              <w:rPr>
-                <w:b w:val="false"/>
-                <w:bCs w:val="false"/>
-                <w:color w:val="1D2B22"/>
-                <w:sz w:val="18"/>
-                <w:szCs w:val="18"/>
-              </w:rPr>
-              <w:t xml:space="preserve">SOS</w:t>
-            </w:r>
-          </w:p>
-        </w:tc>
-        <w:tc>
-          <w:tcPr>
-            <w:tcW w:type="dxa" w:w="5838"/>
-            <w:tcBorders>
-              <w:top w:val="single" w:color="C9D8CC" w:sz="2"/>
-              <w:left w:val="single" w:color="C9D8CC" w:sz="2"/>
-              <w:bottom w:val="single" w:color="C9D8CC" w:sz="2"/>
-              <w:right w:val="single" w:color="C9D8CC" w:sz="2"/>
-            </w:tcBorders>
-            <w:tcMar>
-              <w:top w:type="dxa" w:w="70"/>
-              <w:left w:type="dxa" w:w="110"/>
-              <w:bottom w:type="dxa" w:w="70"/>
-              <w:right w:type="dxa" w:w="110"/>
-            </w:tcMar>
-            <w:vAlign w:val="center"/>
-          </w:tcPr>
-          <w:p>
-            <w:pPr>
-              <w:spacing w:after="20" w:line="276"/>
-              <w:jc w:val="left"/>
-            </w:pPr>
-            <w:r>
-              <w:rPr>
-                <w:b w:val="false"/>
-                <w:bCs w:val="false"/>
-                <w:color w:val="1D2B22"/>
-                <w:sz w:val="18"/>
-                <w:szCs w:val="18"/>
-              </w:rPr>
-              <w:t xml:space="preserve">SOS 3초 길게 누르기 → 국가지점번호·좌표가 119 메시지로 구성되는 화면 확인</w:t>
-            </w:r>
-          </w:p>
-        </w:tc>
-      </w:tr>
-      <w:tr>
-        <w:tc>
-          <w:tcPr>
-            <w:tcW w:type="dxa" w:w="900"/>
-            <w:tcBorders>
-              <w:top w:val="single" w:color="C9D8CC" w:sz="2"/>
-              <w:left w:val="single" w:color="C9D8CC" w:sz="2"/>
-              <w:bottom w:val="single" w:color="C9D8CC" w:sz="2"/>
-              <w:right w:val="single" w:color="C9D8CC" w:sz="2"/>
-            </w:tcBorders>
-            <w:tcMar>
-              <w:top w:type="dxa" w:w="70"/>
-              <w:left w:type="dxa" w:w="110"/>
-              <w:bottom w:type="dxa" w:w="70"/>
-              <w:right w:type="dxa" w:w="110"/>
-            </w:tcMar>
-            <w:vAlign w:val="center"/>
-          </w:tcPr>
-          <w:p>
-            <w:pPr>
-              <w:spacing w:after="20" w:line="276"/>
-              <w:jc w:val="left"/>
-            </w:pPr>
-            <w:r>
-              <w:rPr>
-                <w:b w:val="false"/>
-                <w:bCs w:val="false"/>
-                <w:color w:val="1D2B22"/>
-                <w:sz w:val="18"/>
-                <w:szCs w:val="18"/>
-              </w:rPr>
-              <w:t xml:space="preserve">6</w:t>
-            </w:r>
-          </w:p>
-        </w:tc>
-        <w:tc>
-          <w:tcPr>
-            <w:tcW w:type="dxa" w:w="2900"/>
-            <w:tcBorders>
-              <w:top w:val="single" w:color="C9D8CC" w:sz="2"/>
-              <w:left w:val="single" w:color="C9D8CC" w:sz="2"/>
-              <w:bottom w:val="single" w:color="C9D8CC" w:sz="2"/>
-              <w:right w:val="single" w:color="C9D8CC" w:sz="2"/>
-            </w:tcBorders>
-            <w:tcMar>
-              <w:top w:type="dxa" w:w="70"/>
-              <w:left w:type="dxa" w:w="110"/>
-              <w:bottom w:type="dxa" w:w="70"/>
-              <w:right w:type="dxa" w:w="110"/>
-            </w:tcMar>
-            <w:vAlign w:val="center"/>
-          </w:tcPr>
-          <w:p>
-            <w:pPr>
-              <w:spacing w:after="20" w:line="276"/>
-              <w:jc w:val="left"/>
-            </w:pPr>
-            <w:r>
-              <w:rPr>
-                <w:b w:val="false"/>
-                <w:bCs w:val="false"/>
-                <w:color w:val="1D2B22"/>
-                <w:sz w:val="18"/>
-                <w:szCs w:val="18"/>
-              </w:rPr>
-              <w:t xml:space="preserve">관제 웹</w:t>
-            </w:r>
-          </w:p>
-        </w:tc>
-        <w:tc>
-          <w:tcPr>
-            <w:tcW w:type="dxa" w:w="5838"/>
-            <w:tcBorders>
-              <w:top w:val="single" w:color="C9D8CC" w:sz="2"/>
-              <w:left w:val="single" w:color="C9D8CC" w:sz="2"/>
-              <w:bottom w:val="single" w:color="C9D8CC" w:sz="2"/>
-              <w:right w:val="single" w:color="C9D8CC" w:sz="2"/>
-            </w:tcBorders>
-            <w:tcMar>
-              <w:top w:type="dxa" w:w="70"/>
-              <w:left w:type="dxa" w:w="110"/>
-              <w:bottom w:type="dxa" w:w="70"/>
-              <w:right w:type="dxa" w:w="110"/>
-            </w:tcMar>
-            <w:vAlign w:val="center"/>
-          </w:tcPr>
-          <w:p>
-            <w:pPr>
-              <w:spacing w:after="20" w:line="276"/>
-              <w:jc w:val="left"/>
-            </w:pPr>
-            <w:r>
-              <w:rPr>
-                <w:b w:val="false"/>
-                <w:bCs w:val="false"/>
-                <w:color w:val="1D2B22"/>
-                <w:sz w:val="18"/>
-                <w:szCs w:val="18"/>
-              </w:rPr>
-              <w:t xml:space="preserve">방금 발생시킨 SOS가 대시보드에 실시간 표출 — 구조거점 매칭·헬기 경로 확인</w:t>
-            </w:r>
-          </w:p>
-        </w:tc>
-      </w:tr>
-      <w:tr>
-        <w:tc>
-          <w:tcPr>
-            <w:tcW w:type="dxa" w:w="900"/>
-            <w:tcBorders>
-              <w:top w:val="single" w:color="C9D8CC" w:sz="2"/>
-              <w:left w:val="single" w:color="C9D8CC" w:sz="2"/>
-              <w:bottom w:val="single" w:color="C9D8CC" w:sz="2"/>
-              <w:right w:val="single" w:color="C9D8CC" w:sz="2"/>
-            </w:tcBorders>
-            <w:tcMar>
-              <w:top w:type="dxa" w:w="70"/>
-              <w:left w:type="dxa" w:w="110"/>
-              <w:bottom w:type="dxa" w:w="70"/>
-              <w:right w:type="dxa" w:w="110"/>
-            </w:tcMar>
-            <w:vAlign w:val="center"/>
-          </w:tcPr>
-          <w:p>
-            <w:pPr>
-              <w:spacing w:after="20" w:line="276"/>
-              <w:jc w:val="left"/>
-            </w:pPr>
-            <w:r>
-              <w:rPr>
-                <w:b w:val="false"/>
-                <w:bCs w:val="false"/>
-                <w:color w:val="1D2B22"/>
-                <w:sz w:val="18"/>
-                <w:szCs w:val="18"/>
-              </w:rPr>
-              <w:t xml:space="preserve">7</w:t>
-            </w:r>
-          </w:p>
-        </w:tc>
-        <w:tc>
-          <w:tcPr>
-            <w:tcW w:type="dxa" w:w="2900"/>
-            <w:tcBorders>
-              <w:top w:val="single" w:color="C9D8CC" w:sz="2"/>
-              <w:left w:val="single" w:color="C9D8CC" w:sz="2"/>
-              <w:bottom w:val="single" w:color="C9D8CC" w:sz="2"/>
-              <w:right w:val="single" w:color="C9D8CC" w:sz="2"/>
-            </w:tcBorders>
-            <w:tcMar>
-              <w:top w:type="dxa" w:w="70"/>
-              <w:left w:type="dxa" w:w="110"/>
-              <w:bottom w:type="dxa" w:w="70"/>
-              <w:right w:type="dxa" w:w="110"/>
-            </w:tcMar>
-            <w:vAlign w:val="center"/>
-          </w:tcPr>
-          <w:p>
-            <w:pPr>
-              <w:spacing w:after="20" w:line="276"/>
-              <w:jc w:val="left"/>
-            </w:pPr>
-            <w:r>
-              <w:rPr>
-                <w:b w:val="false"/>
-                <w:bCs w:val="false"/>
-                <w:color w:val="1D2B22"/>
-                <w:sz w:val="18"/>
-                <w:szCs w:val="18"/>
-              </w:rPr>
-              <w:t xml:space="preserve">마이</w:t>
-            </w:r>
-          </w:p>
-        </w:tc>
-        <w:tc>
-          <w:tcPr>
-            <w:tcW w:type="dxa" w:w="5838"/>
-            <w:tcBorders>
-              <w:top w:val="single" w:color="C9D8CC" w:sz="2"/>
-              <w:left w:val="single" w:color="C9D8CC" w:sz="2"/>
-              <w:bottom w:val="single" w:color="C9D8CC" w:sz="2"/>
-              <w:right w:val="single" w:color="C9D8CC" w:sz="2"/>
-            </w:tcBorders>
-            <w:tcMar>
-              <w:top w:type="dxa" w:w="70"/>
-              <w:left w:type="dxa" w:w="110"/>
-              <w:bottom w:type="dxa" w:w="70"/>
-              <w:right w:type="dxa" w:w="110"/>
-            </w:tcMar>
-            <w:vAlign w:val="center"/>
-          </w:tcPr>
-          <w:p>
-            <w:pPr>
-              <w:spacing w:after="20" w:line="276"/>
-              <w:jc w:val="left"/>
-            </w:pPr>
-            <w:r>
-              <w:rPr>
-                <w:b w:val="false"/>
-                <w:bCs w:val="false"/>
-                <w:color w:val="1D2B22"/>
-                <w:sz w:val="18"/>
-                <w:szCs w:val="18"/>
-              </w:rPr>
-              <w:t xml:space="preserve">산행 리포트·탄소흡수 기여·1일 안심보험(990원) 가입 흐름</w:t>
-            </w:r>
-          </w:p>
-        </w:tc>
-      </w:tr>
-    </w:tbl>
-    <w:p>
-      <w:pPr>
-        <w:spacing w:before="120"/>
-      </w:pPr>
-      <w:r>
-        <w:rPr>
-          <w:b/>
-          <w:bCs/>
-          <w:color w:val="1D2B22"/>
-        </w:rPr>
-        <w:t xml:space="preserve">기술 스택: </w:t>
-      </w:r>
-      <w:r>
-        <w:rPr>
-          <w:color w:val="1D2B22"/>
           <w:sz w:val="18"/>
           <w:szCs w:val="18"/>
         </w:rPr>
-        <w:t xml:space="preserve">Flutter(앱) · React(관제 웹) · FastAPI · PostGIS 공간DB · Airflow ETL · AWS(EKS) · FCM/APNs 푸시 · WebSocket 실시간 스트림 · 온디바이스 TFLite</w:t>
-      </w:r>
-    </w:p>
-    <w:p>
-      <w:r>
-        <w:br w:type="page"/>
-      </w:r>
-    </w:p>
-    <w:p>
-      <w:pPr>
-        <w:pStyle w:val="Heading1"/>
-        <w:pBdr>
-          <w:bottom w:val="single" w:color="40916C" w:sz="10" w:space="2"/>
-        </w:pBdr>
-        <w:spacing w:after="160" w:before="360"/>
-      </w:pPr>
-      <w:r>
-        <w:rPr>
-          <w:b/>
-          <w:bCs/>
-          <w:color w:val="1B4332"/>
-        </w:rPr>
-        <w:t xml:space="preserve">5. 발전 가능성</w:t>
+        <w:t xml:space="preserve">서비스 소개 웹 — 라이브 앱 데모 내장, 기능·데이터 출처·B2G 안내 (개발 완료)</w:t>
       </w:r>
     </w:p>
     <w:p>
@@ -6404,7 +4845,7 @@
           <w:bCs/>
           <w:color w:val="2D6A4F"/>
         </w:rPr>
-        <w:t xml:space="preserve">5-1. 시장 규모와 기회</w:t>
+        <w:t xml:space="preserve">4-3. 시스템 구성도 및 핵심 AI 기술</w:t>
       </w:r>
     </w:p>
     <w:p>
@@ -6415,9 +4856,9 @@
       <w:r>
         <w:drawing>
           <wp:inline distT="0" distB="0" distL="0" distR="0">
-            <wp:extent cx="5524500" cy="2466975"/>
+            <wp:extent cx="6096000" cy="3171825"/>
             <wp:effectExtent t="0" r="0" b="0" l="0"/>
-            <wp:docPr id="1" name="chart_market.png" descr="chart_market.png" title="chart_market.png"/>
+            <wp:docPr id="1" name="diagram_arch.png" descr="diagram_arch.png" title="diagram_arch.png"/>
             <wp:cNvGraphicFramePr>
               <a:graphicFrameLocks xmlns:a="http://schemas.openxmlformats.org/drawingml/2006/main" noChangeAspect="1"/>
             </wp:cNvGraphicFramePr>
@@ -6440,7 +4881,7 @@
                   <pic:spPr bwMode="auto">
                     <a:xfrm>
                       <a:off x="0" y="0"/>
-                      <a:ext cx="5524500" cy="2466975"/>
+                      <a:ext cx="6096000" cy="3171825"/>
                     </a:xfrm>
                     <a:prstGeom prst="rect">
                       <a:avLst/>
@@ -6451,31 +4892,6 @@
             </a:graphic>
           </wp:inline>
         </w:drawing>
-      </w:r>
-    </w:p>
-    <w:p>
-      <w:pPr>
-        <w:spacing w:after="120" w:line="312"/>
-      </w:pPr>
-      <w:r>
-        <w:rPr>
-          <w:color w:val="1D2B22"/>
-        </w:rPr>
-        <w:t xml:space="preserve">등산은 국민 성인 78%가 월 1회 이상 즐기는 압도적 1위 야외활동이며, 코로나 이후 2030 신규 유입과 K-하이킹 인바운드 관광 수요가 더해지고 있습니다. 반면 ‘안전’을 본업으로 하는 디지털 서비스는 공백 — 숲길동무가 첫 번째 주자입니다.</w:t>
-      </w:r>
-    </w:p>
-    <w:p>
-      <w:pPr>
-        <w:pStyle w:val="Heading2"/>
-        <w:spacing w:after="120" w:before="240"/>
-      </w:pPr>
-      <w:r>
-        <w:rPr>
-          <w:b/>
-          <w:bCs/>
-          <w:color w:val="2D6A4F"/>
-        </w:rPr>
-        <w:t xml:space="preserve">5-2. 수익모델 4축과 매출 전망</w:t>
       </w:r>
     </w:p>
     <w:tbl>
@@ -6491,9 +4907,9 @@
         </w:tblBorders>
       </w:tblPr>
       <w:tblGrid>
-        <w:gridCol w:w="2200"/>
-        <w:gridCol w:w="4538"/>
-        <w:gridCol w:w="2900"/>
+        <w:gridCol w:w="2300"/>
+        <w:gridCol w:w="3300"/>
+        <w:gridCol w:w="4038"/>
       </w:tblGrid>
       <w:tr>
         <w:trPr>
@@ -6501,7 +4917,7 @@
         </w:trPr>
         <w:tc>
           <w:tcPr>
-            <w:tcW w:type="dxa" w:w="2200"/>
+            <w:tcW w:type="dxa" w:w="2300"/>
             <w:tcBorders>
               <w:top w:val="single" w:color="C9D8CC" w:sz="2"/>
               <w:left w:val="single" w:color="C9D8CC" w:sz="2"/>
@@ -6530,13 +4946,13 @@
                 <w:sz w:val="18"/>
                 <w:szCs w:val="18"/>
               </w:rPr>
-              <w:t xml:space="preserve">수익원</w:t>
-            </w:r>
-          </w:p>
-        </w:tc>
-        <w:tc>
-          <w:tcPr>
-            <w:tcW w:type="dxa" w:w="4538"/>
+              <w:t xml:space="preserve">AI 엔진</w:t>
+            </w:r>
+          </w:p>
+        </w:tc>
+        <w:tc>
+          <w:tcPr>
+            <w:tcW w:type="dxa" w:w="3300"/>
             <w:tcBorders>
               <w:top w:val="single" w:color="C9D8CC" w:sz="2"/>
               <w:left w:val="single" w:color="C9D8CC" w:sz="2"/>
@@ -6565,13 +4981,13 @@
                 <w:sz w:val="18"/>
                 <w:szCs w:val="18"/>
               </w:rPr>
-              <w:t xml:space="preserve">내용</w:t>
-            </w:r>
-          </w:p>
-        </w:tc>
-        <w:tc>
-          <w:tcPr>
-            <w:tcW w:type="dxa" w:w="2900"/>
+              <w:t xml:space="preserve">모델·기법</w:t>
+            </w:r>
+          </w:p>
+        </w:tc>
+        <w:tc>
+          <w:tcPr>
+            <w:tcW w:type="dxa" w:w="4038"/>
             <w:tcBorders>
               <w:top w:val="single" w:color="C9D8CC" w:sz="2"/>
               <w:left w:val="single" w:color="C9D8CC" w:sz="2"/>
@@ -6600,7 +5016,7 @@
                 <w:sz w:val="18"/>
                 <w:szCs w:val="18"/>
               </w:rPr>
-              <w:t xml:space="preserve">가격(안)</w:t>
+              <w:t xml:space="preserve">입력 데이터 → 출력</w:t>
             </w:r>
           </w:p>
         </w:tc>
@@ -6608,103 +5024,103 @@
       <w:tr>
         <w:tc>
           <w:tcPr>
-            <w:tcW w:type="dxa" w:w="2200"/>
-            <w:tcBorders>
-              <w:top w:val="single" w:color="C9D8CC" w:sz="2"/>
-              <w:left w:val="single" w:color="C9D8CC" w:sz="2"/>
-              <w:bottom w:val="single" w:color="C9D8CC" w:sz="2"/>
-              <w:right w:val="single" w:color="C9D8CC" w:sz="2"/>
-            </w:tcBorders>
-            <w:tcMar>
-              <w:top w:type="dxa" w:w="70"/>
-              <w:left w:type="dxa" w:w="110"/>
-              <w:bottom w:type="dxa" w:w="70"/>
-              <w:right w:type="dxa" w:w="110"/>
-            </w:tcMar>
-            <w:vAlign w:val="center"/>
-          </w:tcPr>
-          <w:p>
-            <w:pPr>
-              <w:spacing w:after="20" w:line="276"/>
-              <w:jc w:val="left"/>
-            </w:pPr>
-            <w:r>
-              <w:rPr>
-                <w:b w:val="false"/>
-                <w:bCs w:val="false"/>
-                <w:color w:val="1D2B22"/>
-                <w:sz w:val="18"/>
-                <w:szCs w:val="18"/>
-              </w:rPr>
-              <w:t xml:space="preserve">B2C 프리미엄 구독</w:t>
-            </w:r>
-          </w:p>
-        </w:tc>
-        <w:tc>
-          <w:tcPr>
-            <w:tcW w:type="dxa" w:w="4538"/>
-            <w:tcBorders>
-              <w:top w:val="single" w:color="C9D8CC" w:sz="2"/>
-              <w:left w:val="single" w:color="C9D8CC" w:sz="2"/>
-              <w:bottom w:val="single" w:color="C9D8CC" w:sz="2"/>
-              <w:right w:val="single" w:color="C9D8CC" w:sz="2"/>
-            </w:tcBorders>
-            <w:tcMar>
-              <w:top w:type="dxa" w:w="70"/>
-              <w:left w:type="dxa" w:w="110"/>
-              <w:bottom w:type="dxa" w:w="70"/>
-              <w:right w:type="dxa" w:w="110"/>
-            </w:tcMar>
-            <w:vAlign w:val="center"/>
-          </w:tcPr>
-          <w:p>
-            <w:pPr>
-              <w:spacing w:after="20" w:line="276"/>
-              <w:jc w:val="left"/>
-            </w:pPr>
-            <w:r>
-              <w:rPr>
-                <w:b w:val="false"/>
-                <w:bCs w:val="false"/>
-                <w:color w:val="1D2B22"/>
-                <w:sz w:val="18"/>
-                <w:szCs w:val="18"/>
-              </w:rPr>
-              <w:t xml:space="preserve">오프라인 지도 무제한·가족 안심 공유 확대·AI 무제한</w:t>
-            </w:r>
-          </w:p>
-        </w:tc>
-        <w:tc>
-          <w:tcPr>
-            <w:tcW w:type="dxa" w:w="2900"/>
-            <w:tcBorders>
-              <w:top w:val="single" w:color="C9D8CC" w:sz="2"/>
-              <w:left w:val="single" w:color="C9D8CC" w:sz="2"/>
-              <w:bottom w:val="single" w:color="C9D8CC" w:sz="2"/>
-              <w:right w:val="single" w:color="C9D8CC" w:sz="2"/>
-            </w:tcBorders>
-            <w:tcMar>
-              <w:top w:type="dxa" w:w="70"/>
-              <w:left w:type="dxa" w:w="110"/>
-              <w:bottom w:type="dxa" w:w="70"/>
-              <w:right w:type="dxa" w:w="110"/>
-            </w:tcMar>
-            <w:vAlign w:val="center"/>
-          </w:tcPr>
-          <w:p>
-            <w:pPr>
-              <w:spacing w:after="20" w:line="276"/>
-              <w:jc w:val="left"/>
-            </w:pPr>
-            <w:r>
-              <w:rPr>
-                <w:b w:val="false"/>
-                <w:bCs w:val="false"/>
-                <w:color w:val="1D2B22"/>
-                <w:sz w:val="18"/>
-                <w:szCs w:val="18"/>
-              </w:rPr>
-              <w:t xml:space="preserve">월 4,900원</w:t>
+            <w:tcW w:type="dxa" w:w="2300"/>
+            <w:tcBorders>
+              <w:top w:val="single" w:color="C9D8CC" w:sz="2"/>
+              <w:left w:val="single" w:color="C9D8CC" w:sz="2"/>
+              <w:bottom w:val="single" w:color="C9D8CC" w:sz="2"/>
+              <w:right w:val="single" w:color="C9D8CC" w:sz="2"/>
+            </w:tcBorders>
+            <w:tcMar>
+              <w:top w:type="dxa" w:w="70"/>
+              <w:left w:type="dxa" w:w="110"/>
+              <w:bottom w:type="dxa" w:w="70"/>
+              <w:right w:type="dxa" w:w="110"/>
+            </w:tcMar>
+            <w:vAlign w:val="center"/>
+          </w:tcPr>
+          <w:p>
+            <w:pPr>
+              <w:spacing w:after="20" w:line="276"/>
+              <w:jc w:val="left"/>
+            </w:pPr>
+            <w:r>
+              <w:rPr>
+                <w:b w:val="false"/>
+                <w:bCs w:val="false"/>
+                <w:color w:val="1D2B22"/>
+                <w:sz w:val="18"/>
+                <w:szCs w:val="18"/>
+              </w:rPr>
+              <w:t xml:space="preserve">코스 추천</w:t>
+            </w:r>
+          </w:p>
+        </w:tc>
+        <w:tc>
+          <w:tcPr>
+            <w:tcW w:type="dxa" w:w="3300"/>
+            <w:tcBorders>
+              <w:top w:val="single" w:color="C9D8CC" w:sz="2"/>
+              <w:left w:val="single" w:color="C9D8CC" w:sz="2"/>
+              <w:bottom w:val="single" w:color="C9D8CC" w:sz="2"/>
+              <w:right w:val="single" w:color="C9D8CC" w:sz="2"/>
+            </w:tcBorders>
+            <w:tcMar>
+              <w:top w:type="dxa" w:w="70"/>
+              <w:left w:type="dxa" w:w="110"/>
+              <w:bottom w:type="dxa" w:w="70"/>
+              <w:right w:type="dxa" w:w="110"/>
+            </w:tcMar>
+            <w:vAlign w:val="center"/>
+          </w:tcPr>
+          <w:p>
+            <w:pPr>
+              <w:spacing w:after="20" w:line="276"/>
+              <w:jc w:val="left"/>
+            </w:pPr>
+            <w:r>
+              <w:rPr>
+                <w:b w:val="false"/>
+                <w:bCs w:val="false"/>
+                <w:color w:val="1D2B22"/>
+                <w:sz w:val="18"/>
+                <w:szCs w:val="18"/>
+              </w:rPr>
+              <w:t xml:space="preserve">하이브리드 필터링 + 체력 프로파일</w:t>
+            </w:r>
+          </w:p>
+        </w:tc>
+        <w:tc>
+          <w:tcPr>
+            <w:tcW w:type="dxa" w:w="4038"/>
+            <w:tcBorders>
+              <w:top w:val="single" w:color="C9D8CC" w:sz="2"/>
+              <w:left w:val="single" w:color="C9D8CC" w:sz="2"/>
+              <w:bottom w:val="single" w:color="C9D8CC" w:sz="2"/>
+              <w:right w:val="single" w:color="C9D8CC" w:sz="2"/>
+            </w:tcBorders>
+            <w:tcMar>
+              <w:top w:type="dxa" w:w="70"/>
+              <w:left w:type="dxa" w:w="110"/>
+              <w:bottom w:type="dxa" w:w="70"/>
+              <w:right w:type="dxa" w:w="110"/>
+            </w:tcMar>
+            <w:vAlign w:val="center"/>
+          </w:tcPr>
+          <w:p>
+            <w:pPr>
+              <w:spacing w:after="20" w:line="276"/>
+              <w:jc w:val="left"/>
+            </w:pPr>
+            <w:r>
+              <w:rPr>
+                <w:b w:val="false"/>
+                <w:bCs w:val="false"/>
+                <w:color w:val="1D2B22"/>
+                <w:sz w:val="18"/>
+                <w:szCs w:val="18"/>
+              </w:rPr>
+              <w:t xml:space="preserve">등산로·혼잡·기상·개인 이력 → 매칭률 상위 코스</w:t>
             </w:r>
           </w:p>
         </w:tc>
@@ -6712,103 +5128,103 @@
       <w:tr>
         <w:tc>
           <w:tcPr>
-            <w:tcW w:type="dxa" w:w="2200"/>
-            <w:tcBorders>
-              <w:top w:val="single" w:color="C9D8CC" w:sz="2"/>
-              <w:left w:val="single" w:color="C9D8CC" w:sz="2"/>
-              <w:bottom w:val="single" w:color="C9D8CC" w:sz="2"/>
-              <w:right w:val="single" w:color="C9D8CC" w:sz="2"/>
-            </w:tcBorders>
-            <w:tcMar>
-              <w:top w:type="dxa" w:w="70"/>
-              <w:left w:type="dxa" w:w="110"/>
-              <w:bottom w:type="dxa" w:w="70"/>
-              <w:right w:type="dxa" w:w="110"/>
-            </w:tcMar>
-            <w:vAlign w:val="center"/>
-          </w:tcPr>
-          <w:p>
-            <w:pPr>
-              <w:spacing w:after="20" w:line="276"/>
-              <w:jc w:val="left"/>
-            </w:pPr>
-            <w:r>
-              <w:rPr>
-                <w:b w:val="false"/>
-                <w:bCs w:val="false"/>
-                <w:color w:val="1D2B22"/>
-                <w:sz w:val="18"/>
-                <w:szCs w:val="18"/>
-              </w:rPr>
-              <w:t xml:space="preserve">1일 안심보험 제휴</w:t>
-            </w:r>
-          </w:p>
-        </w:tc>
-        <w:tc>
-          <w:tcPr>
-            <w:tcW w:type="dxa" w:w="4538"/>
-            <w:tcBorders>
-              <w:top w:val="single" w:color="C9D8CC" w:sz="2"/>
-              <w:left w:val="single" w:color="C9D8CC" w:sz="2"/>
-              <w:bottom w:val="single" w:color="C9D8CC" w:sz="2"/>
-              <w:right w:val="single" w:color="C9D8CC" w:sz="2"/>
-            </w:tcBorders>
-            <w:tcMar>
-              <w:top w:type="dxa" w:w="70"/>
-              <w:left w:type="dxa" w:w="110"/>
-              <w:bottom w:type="dxa" w:w="70"/>
-              <w:right w:type="dxa" w:w="110"/>
-            </w:tcMar>
-            <w:vAlign w:val="center"/>
-          </w:tcPr>
-          <w:p>
-            <w:pPr>
-              <w:spacing w:after="20" w:line="276"/>
-              <w:jc w:val="left"/>
-            </w:pPr>
-            <w:r>
-              <w:rPr>
-                <w:b w:val="false"/>
-                <w:bCs w:val="false"/>
-                <w:color w:val="1D2B22"/>
-                <w:sz w:val="18"/>
-                <w:szCs w:val="18"/>
-              </w:rPr>
-              <w:t xml:space="preserve">산행지수 연동 일일보험 인앱 판매 — 판매 수수료</w:t>
-            </w:r>
-          </w:p>
-        </w:tc>
-        <w:tc>
-          <w:tcPr>
-            <w:tcW w:type="dxa" w:w="2900"/>
-            <w:tcBorders>
-              <w:top w:val="single" w:color="C9D8CC" w:sz="2"/>
-              <w:left w:val="single" w:color="C9D8CC" w:sz="2"/>
-              <w:bottom w:val="single" w:color="C9D8CC" w:sz="2"/>
-              <w:right w:val="single" w:color="C9D8CC" w:sz="2"/>
-            </w:tcBorders>
-            <w:tcMar>
-              <w:top w:type="dxa" w:w="70"/>
-              <w:left w:type="dxa" w:w="110"/>
-              <w:bottom w:type="dxa" w:w="70"/>
-              <w:right w:type="dxa" w:w="110"/>
-            </w:tcMar>
-            <w:vAlign w:val="center"/>
-          </w:tcPr>
-          <w:p>
-            <w:pPr>
-              <w:spacing w:after="20" w:line="276"/>
-              <w:jc w:val="left"/>
-            </w:pPr>
-            <w:r>
-              <w:rPr>
-                <w:b w:val="false"/>
-                <w:bCs w:val="false"/>
-                <w:color w:val="1D2B22"/>
-                <w:sz w:val="18"/>
-                <w:szCs w:val="18"/>
-              </w:rPr>
-              <w:t xml:space="preserve">건당 990원~ (수수료 15%)</w:t>
+            <w:tcW w:type="dxa" w:w="2300"/>
+            <w:tcBorders>
+              <w:top w:val="single" w:color="C9D8CC" w:sz="2"/>
+              <w:left w:val="single" w:color="C9D8CC" w:sz="2"/>
+              <w:bottom w:val="single" w:color="C9D8CC" w:sz="2"/>
+              <w:right w:val="single" w:color="C9D8CC" w:sz="2"/>
+            </w:tcBorders>
+            <w:tcMar>
+              <w:top w:type="dxa" w:w="70"/>
+              <w:left w:type="dxa" w:w="110"/>
+              <w:bottom w:type="dxa" w:w="70"/>
+              <w:right w:type="dxa" w:w="110"/>
+            </w:tcMar>
+            <w:vAlign w:val="center"/>
+          </w:tcPr>
+          <w:p>
+            <w:pPr>
+              <w:spacing w:after="20" w:line="276"/>
+              <w:jc w:val="left"/>
+            </w:pPr>
+            <w:r>
+              <w:rPr>
+                <w:b w:val="false"/>
+                <w:bCs w:val="false"/>
+                <w:color w:val="1D2B22"/>
+                <w:sz w:val="18"/>
+                <w:szCs w:val="18"/>
+              </w:rPr>
+              <w:t xml:space="preserve">조난위험 예측</w:t>
+            </w:r>
+          </w:p>
+        </w:tc>
+        <w:tc>
+          <w:tcPr>
+            <w:tcW w:type="dxa" w:w="3300"/>
+            <w:tcBorders>
+              <w:top w:val="single" w:color="C9D8CC" w:sz="2"/>
+              <w:left w:val="single" w:color="C9D8CC" w:sz="2"/>
+              <w:bottom w:val="single" w:color="C9D8CC" w:sz="2"/>
+              <w:right w:val="single" w:color="C9D8CC" w:sz="2"/>
+            </w:tcBorders>
+            <w:tcMar>
+              <w:top w:type="dxa" w:w="70"/>
+              <w:left w:type="dxa" w:w="110"/>
+              <w:bottom w:type="dxa" w:w="70"/>
+              <w:right w:type="dxa" w:w="110"/>
+            </w:tcMar>
+            <w:vAlign w:val="center"/>
+          </w:tcPr>
+          <w:p>
+            <w:pPr>
+              <w:spacing w:after="20" w:line="276"/>
+              <w:jc w:val="left"/>
+            </w:pPr>
+            <w:r>
+              <w:rPr>
+                <w:b w:val="false"/>
+                <w:bCs w:val="false"/>
+                <w:color w:val="1D2B22"/>
+                <w:sz w:val="18"/>
+                <w:szCs w:val="18"/>
+              </w:rPr>
+              <w:t xml:space="preserve">시계열 이상탐지(LSTM-AE)</w:t>
+            </w:r>
+          </w:p>
+        </w:tc>
+        <w:tc>
+          <w:tcPr>
+            <w:tcW w:type="dxa" w:w="4038"/>
+            <w:tcBorders>
+              <w:top w:val="single" w:color="C9D8CC" w:sz="2"/>
+              <w:left w:val="single" w:color="C9D8CC" w:sz="2"/>
+              <w:bottom w:val="single" w:color="C9D8CC" w:sz="2"/>
+              <w:right w:val="single" w:color="C9D8CC" w:sz="2"/>
+            </w:tcBorders>
+            <w:tcMar>
+              <w:top w:type="dxa" w:w="70"/>
+              <w:left w:type="dxa" w:w="110"/>
+              <w:bottom w:type="dxa" w:w="70"/>
+              <w:right w:type="dxa" w:w="110"/>
+            </w:tcMar>
+            <w:vAlign w:val="center"/>
+          </w:tcPr>
+          <w:p>
+            <w:pPr>
+              <w:spacing w:after="20" w:line="276"/>
+              <w:jc w:val="left"/>
+            </w:pPr>
+            <w:r>
+              <w:rPr>
+                <w:b w:val="false"/>
+                <w:bCs w:val="false"/>
+                <w:color w:val="1D2B22"/>
+                <w:sz w:val="18"/>
+                <w:szCs w:val="18"/>
+              </w:rPr>
+              <w:t xml:space="preserve">GPS 궤적·정지시간·심박 → 조난 의심 스코어</w:t>
             </w:r>
           </w:p>
         </w:tc>
@@ -6816,103 +5232,103 @@
       <w:tr>
         <w:tc>
           <w:tcPr>
-            <w:tcW w:type="dxa" w:w="2200"/>
-            <w:tcBorders>
-              <w:top w:val="single" w:color="C9D8CC" w:sz="2"/>
-              <w:left w:val="single" w:color="C9D8CC" w:sz="2"/>
-              <w:bottom w:val="single" w:color="C9D8CC" w:sz="2"/>
-              <w:right w:val="single" w:color="C9D8CC" w:sz="2"/>
-            </w:tcBorders>
-            <w:tcMar>
-              <w:top w:type="dxa" w:w="70"/>
-              <w:left w:type="dxa" w:w="110"/>
-              <w:bottom w:type="dxa" w:w="70"/>
-              <w:right w:type="dxa" w:w="110"/>
-            </w:tcMar>
-            <w:vAlign w:val="center"/>
-          </w:tcPr>
-          <w:p>
-            <w:pPr>
-              <w:spacing w:after="20" w:line="276"/>
-              <w:jc w:val="left"/>
-            </w:pPr>
-            <w:r>
-              <w:rPr>
-                <w:b w:val="false"/>
-                <w:bCs w:val="false"/>
-                <w:color w:val="1D2B22"/>
-                <w:sz w:val="18"/>
-                <w:szCs w:val="18"/>
-              </w:rPr>
-              <w:t xml:space="preserve">B2G 관제 SaaS</w:t>
-            </w:r>
-          </w:p>
-        </w:tc>
-        <w:tc>
-          <w:tcPr>
-            <w:tcW w:type="dxa" w:w="4538"/>
-            <w:tcBorders>
-              <w:top w:val="single" w:color="C9D8CC" w:sz="2"/>
-              <w:left w:val="single" w:color="C9D8CC" w:sz="2"/>
-              <w:bottom w:val="single" w:color="C9D8CC" w:sz="2"/>
-              <w:right w:val="single" w:color="C9D8CC" w:sz="2"/>
-            </w:tcBorders>
-            <w:tcMar>
-              <w:top w:type="dxa" w:w="70"/>
-              <w:left w:type="dxa" w:w="110"/>
-              <w:bottom w:type="dxa" w:w="70"/>
-              <w:right w:type="dxa" w:w="110"/>
-            </w:tcMar>
-            <w:vAlign w:val="center"/>
-          </w:tcPr>
-          <w:p>
-            <w:pPr>
-              <w:spacing w:after="20" w:line="276"/>
-              <w:jc w:val="left"/>
-            </w:pPr>
-            <w:r>
-              <w:rPr>
-                <w:b w:val="false"/>
-                <w:bCs w:val="false"/>
-                <w:color w:val="1D2B22"/>
-                <w:sz w:val="18"/>
-                <w:szCs w:val="18"/>
-              </w:rPr>
-              <w:t xml:space="preserve">지자체·국립공원·소방 대시보드 라이선스</w:t>
-            </w:r>
-          </w:p>
-        </w:tc>
-        <w:tc>
-          <w:tcPr>
-            <w:tcW w:type="dxa" w:w="2900"/>
-            <w:tcBorders>
-              <w:top w:val="single" w:color="C9D8CC" w:sz="2"/>
-              <w:left w:val="single" w:color="C9D8CC" w:sz="2"/>
-              <w:bottom w:val="single" w:color="C9D8CC" w:sz="2"/>
-              <w:right w:val="single" w:color="C9D8CC" w:sz="2"/>
-            </w:tcBorders>
-            <w:tcMar>
-              <w:top w:type="dxa" w:w="70"/>
-              <w:left w:type="dxa" w:w="110"/>
-              <w:bottom w:type="dxa" w:w="70"/>
-              <w:right w:type="dxa" w:w="110"/>
-            </w:tcMar>
-            <w:vAlign w:val="center"/>
-          </w:tcPr>
-          <w:p>
-            <w:pPr>
-              <w:spacing w:after="20" w:line="276"/>
-              <w:jc w:val="left"/>
-            </w:pPr>
-            <w:r>
-              <w:rPr>
-                <w:b w:val="false"/>
-                <w:bCs w:val="false"/>
-                <w:color w:val="1D2B22"/>
-                <w:sz w:val="18"/>
-                <w:szCs w:val="18"/>
-              </w:rPr>
-              <w:t xml:space="preserve">기관당 연 3~8천만 원</w:t>
+            <w:tcW w:type="dxa" w:w="2300"/>
+            <w:tcBorders>
+              <w:top w:val="single" w:color="C9D8CC" w:sz="2"/>
+              <w:left w:val="single" w:color="C9D8CC" w:sz="2"/>
+              <w:bottom w:val="single" w:color="C9D8CC" w:sz="2"/>
+              <w:right w:val="single" w:color="C9D8CC" w:sz="2"/>
+            </w:tcBorders>
+            <w:tcMar>
+              <w:top w:type="dxa" w:w="70"/>
+              <w:left w:type="dxa" w:w="110"/>
+              <w:bottom w:type="dxa" w:w="70"/>
+              <w:right w:type="dxa" w:w="110"/>
+            </w:tcMar>
+            <w:vAlign w:val="center"/>
+          </w:tcPr>
+          <w:p>
+            <w:pPr>
+              <w:spacing w:after="20" w:line="276"/>
+              <w:jc w:val="left"/>
+            </w:pPr>
+            <w:r>
+              <w:rPr>
+                <w:b w:val="false"/>
+                <w:bCs w:val="false"/>
+                <w:color w:val="1D2B22"/>
+                <w:sz w:val="18"/>
+                <w:szCs w:val="18"/>
+              </w:rPr>
+              <w:t xml:space="preserve">위험도 융합 스코어</w:t>
+            </w:r>
+          </w:p>
+        </w:tc>
+        <w:tc>
+          <w:tcPr>
+            <w:tcW w:type="dxa" w:w="3300"/>
+            <w:tcBorders>
+              <w:top w:val="single" w:color="C9D8CC" w:sz="2"/>
+              <w:left w:val="single" w:color="C9D8CC" w:sz="2"/>
+              <w:bottom w:val="single" w:color="C9D8CC" w:sz="2"/>
+              <w:right w:val="single" w:color="C9D8CC" w:sz="2"/>
+            </w:tcBorders>
+            <w:tcMar>
+              <w:top w:type="dxa" w:w="70"/>
+              <w:left w:type="dxa" w:w="110"/>
+              <w:bottom w:type="dxa" w:w="70"/>
+              <w:right w:type="dxa" w:w="110"/>
+            </w:tcMar>
+            <w:vAlign w:val="center"/>
+          </w:tcPr>
+          <w:p>
+            <w:pPr>
+              <w:spacing w:after="20" w:line="276"/>
+              <w:jc w:val="left"/>
+            </w:pPr>
+            <w:r>
+              <w:rPr>
+                <w:b w:val="false"/>
+                <w:bCs w:val="false"/>
+                <w:color w:val="1D2B22"/>
+                <w:sz w:val="18"/>
+                <w:szCs w:val="18"/>
+              </w:rPr>
+              <w:t xml:space="preserve">XGBoost 회귀</w:t>
+            </w:r>
+          </w:p>
+        </w:tc>
+        <w:tc>
+          <w:tcPr>
+            <w:tcW w:type="dxa" w:w="4038"/>
+            <w:tcBorders>
+              <w:top w:val="single" w:color="C9D8CC" w:sz="2"/>
+              <w:left w:val="single" w:color="C9D8CC" w:sz="2"/>
+              <w:bottom w:val="single" w:color="C9D8CC" w:sz="2"/>
+              <w:right w:val="single" w:color="C9D8CC" w:sz="2"/>
+            </w:tcBorders>
+            <w:tcMar>
+              <w:top w:type="dxa" w:w="70"/>
+              <w:left w:type="dxa" w:w="110"/>
+              <w:bottom w:type="dxa" w:w="70"/>
+              <w:right w:type="dxa" w:w="110"/>
+            </w:tcMar>
+            <w:vAlign w:val="center"/>
+          </w:tcPr>
+          <w:p>
+            <w:pPr>
+              <w:spacing w:after="20" w:line="276"/>
+              <w:jc w:val="left"/>
+            </w:pPr>
+            <w:r>
+              <w:rPr>
+                <w:b w:val="false"/>
+                <w:bCs w:val="false"/>
+                <w:color w:val="1D2B22"/>
+                <w:sz w:val="18"/>
+                <w:szCs w:val="18"/>
+              </w:rPr>
+              <w:t xml:space="preserve">산사태등급·실측기상·사고이력·강우 → 구간 위험도 0~100</w:t>
             </w:r>
           </w:p>
         </w:tc>
@@ -6920,103 +5336,207 @@
       <w:tr>
         <w:tc>
           <w:tcPr>
-            <w:tcW w:type="dxa" w:w="2200"/>
-            <w:tcBorders>
-              <w:top w:val="single" w:color="C9D8CC" w:sz="2"/>
-              <w:left w:val="single" w:color="C9D8CC" w:sz="2"/>
-              <w:bottom w:val="single" w:color="C9D8CC" w:sz="2"/>
-              <w:right w:val="single" w:color="C9D8CC" w:sz="2"/>
-            </w:tcBorders>
-            <w:tcMar>
-              <w:top w:type="dxa" w:w="70"/>
-              <w:left w:type="dxa" w:w="110"/>
-              <w:bottom w:type="dxa" w:w="70"/>
-              <w:right w:type="dxa" w:w="110"/>
-            </w:tcMar>
-            <w:vAlign w:val="center"/>
-          </w:tcPr>
-          <w:p>
-            <w:pPr>
-              <w:spacing w:after="20" w:line="276"/>
-              <w:jc w:val="left"/>
-            </w:pPr>
-            <w:r>
-              <w:rPr>
-                <w:b w:val="false"/>
-                <w:bCs w:val="false"/>
-                <w:color w:val="1D2B22"/>
-                <w:sz w:val="18"/>
-                <w:szCs w:val="18"/>
-              </w:rPr>
-              <w:t xml:space="preserve">제휴·커머스</w:t>
-            </w:r>
-          </w:p>
-        </w:tc>
-        <w:tc>
-          <w:tcPr>
-            <w:tcW w:type="dxa" w:w="4538"/>
-            <w:tcBorders>
-              <w:top w:val="single" w:color="C9D8CC" w:sz="2"/>
-              <w:left w:val="single" w:color="C9D8CC" w:sz="2"/>
-              <w:bottom w:val="single" w:color="C9D8CC" w:sz="2"/>
-              <w:right w:val="single" w:color="C9D8CC" w:sz="2"/>
-            </w:tcBorders>
-            <w:tcMar>
-              <w:top w:type="dxa" w:w="70"/>
-              <w:left w:type="dxa" w:w="110"/>
-              <w:bottom w:type="dxa" w:w="70"/>
-              <w:right w:type="dxa" w:w="110"/>
-            </w:tcMar>
-            <w:vAlign w:val="center"/>
-          </w:tcPr>
-          <w:p>
-            <w:pPr>
-              <w:spacing w:after="20" w:line="276"/>
-              <w:jc w:val="left"/>
-            </w:pPr>
-            <w:r>
-              <w:rPr>
-                <w:b w:val="false"/>
-                <w:bCs w:val="false"/>
-                <w:color w:val="1D2B22"/>
-                <w:sz w:val="18"/>
-                <w:szCs w:val="18"/>
-              </w:rPr>
-              <w:t xml:space="preserve">아웃도어 브랜드 제휴·휴양림 예약 수수료</w:t>
-            </w:r>
-          </w:p>
-        </w:tc>
-        <w:tc>
-          <w:tcPr>
-            <w:tcW w:type="dxa" w:w="2900"/>
-            <w:tcBorders>
-              <w:top w:val="single" w:color="C9D8CC" w:sz="2"/>
-              <w:left w:val="single" w:color="C9D8CC" w:sz="2"/>
-              <w:bottom w:val="single" w:color="C9D8CC" w:sz="2"/>
-              <w:right w:val="single" w:color="C9D8CC" w:sz="2"/>
-            </w:tcBorders>
-            <w:tcMar>
-              <w:top w:type="dxa" w:w="70"/>
-              <w:left w:type="dxa" w:w="110"/>
-              <w:bottom w:type="dxa" w:w="70"/>
-              <w:right w:type="dxa" w:w="110"/>
-            </w:tcMar>
-            <w:vAlign w:val="center"/>
-          </w:tcPr>
-          <w:p>
-            <w:pPr>
-              <w:spacing w:after="20" w:line="276"/>
-              <w:jc w:val="left"/>
-            </w:pPr>
-            <w:r>
-              <w:rPr>
-                <w:b w:val="false"/>
-                <w:bCs w:val="false"/>
-                <w:color w:val="1D2B22"/>
-                <w:sz w:val="18"/>
-                <w:szCs w:val="18"/>
-              </w:rPr>
-              <w:t xml:space="preserve">예약 건당 5~10%</w:t>
+            <w:tcW w:type="dxa" w:w="2300"/>
+            <w:tcBorders>
+              <w:top w:val="single" w:color="C9D8CC" w:sz="2"/>
+              <w:left w:val="single" w:color="C9D8CC" w:sz="2"/>
+              <w:bottom w:val="single" w:color="C9D8CC" w:sz="2"/>
+              <w:right w:val="single" w:color="C9D8CC" w:sz="2"/>
+            </w:tcBorders>
+            <w:tcMar>
+              <w:top w:type="dxa" w:w="70"/>
+              <w:left w:type="dxa" w:w="110"/>
+              <w:bottom w:type="dxa" w:w="70"/>
+              <w:right w:type="dxa" w:w="110"/>
+            </w:tcMar>
+            <w:vAlign w:val="center"/>
+          </w:tcPr>
+          <w:p>
+            <w:pPr>
+              <w:spacing w:after="20" w:line="276"/>
+              <w:jc w:val="left"/>
+            </w:pPr>
+            <w:r>
+              <w:rPr>
+                <w:b w:val="false"/>
+                <w:bCs w:val="false"/>
+                <w:color w:val="1D2B22"/>
+                <w:sz w:val="18"/>
+                <w:szCs w:val="18"/>
+              </w:rPr>
+              <w:t xml:space="preserve">식물·독버섯 판별</w:t>
+            </w:r>
+          </w:p>
+        </w:tc>
+        <w:tc>
+          <w:tcPr>
+            <w:tcW w:type="dxa" w:w="3300"/>
+            <w:tcBorders>
+              <w:top w:val="single" w:color="C9D8CC" w:sz="2"/>
+              <w:left w:val="single" w:color="C9D8CC" w:sz="2"/>
+              <w:bottom w:val="single" w:color="C9D8CC" w:sz="2"/>
+              <w:right w:val="single" w:color="C9D8CC" w:sz="2"/>
+            </w:tcBorders>
+            <w:tcMar>
+              <w:top w:type="dxa" w:w="70"/>
+              <w:left w:type="dxa" w:w="110"/>
+              <w:bottom w:type="dxa" w:w="70"/>
+              <w:right w:type="dxa" w:w="110"/>
+            </w:tcMar>
+            <w:vAlign w:val="center"/>
+          </w:tcPr>
+          <w:p>
+            <w:pPr>
+              <w:spacing w:after="20" w:line="276"/>
+              <w:jc w:val="left"/>
+            </w:pPr>
+            <w:r>
+              <w:rPr>
+                <w:b w:val="false"/>
+                <w:bCs w:val="false"/>
+                <w:color w:val="1D2B22"/>
+                <w:sz w:val="18"/>
+                <w:szCs w:val="18"/>
+              </w:rPr>
+              <w:t xml:space="preserve">EfficientNet 경량화(온디바이스)</w:t>
+            </w:r>
+          </w:p>
+        </w:tc>
+        <w:tc>
+          <w:tcPr>
+            <w:tcW w:type="dxa" w:w="4038"/>
+            <w:tcBorders>
+              <w:top w:val="single" w:color="C9D8CC" w:sz="2"/>
+              <w:left w:val="single" w:color="C9D8CC" w:sz="2"/>
+              <w:bottom w:val="single" w:color="C9D8CC" w:sz="2"/>
+              <w:right w:val="single" w:color="C9D8CC" w:sz="2"/>
+            </w:tcBorders>
+            <w:tcMar>
+              <w:top w:type="dxa" w:w="70"/>
+              <w:left w:type="dxa" w:w="110"/>
+              <w:bottom w:type="dxa" w:w="70"/>
+              <w:right w:type="dxa" w:w="110"/>
+            </w:tcMar>
+            <w:vAlign w:val="center"/>
+          </w:tcPr>
+          <w:p>
+            <w:pPr>
+              <w:spacing w:after="20" w:line="276"/>
+              <w:jc w:val="left"/>
+            </w:pPr>
+            <w:r>
+              <w:rPr>
+                <w:b w:val="false"/>
+                <w:bCs w:val="false"/>
+                <w:color w:val="1D2B22"/>
+                <w:sz w:val="18"/>
+                <w:szCs w:val="18"/>
+              </w:rPr>
+              <w:t xml:space="preserve">사진 → 종 분류 + 독성 경고(신뢰도)</w:t>
+            </w:r>
+          </w:p>
+        </w:tc>
+      </w:tr>
+      <w:tr>
+        <w:tc>
+          <w:tcPr>
+            <w:tcW w:type="dxa" w:w="2300"/>
+            <w:tcBorders>
+              <w:top w:val="single" w:color="C9D8CC" w:sz="2"/>
+              <w:left w:val="single" w:color="C9D8CC" w:sz="2"/>
+              <w:bottom w:val="single" w:color="C9D8CC" w:sz="2"/>
+              <w:right w:val="single" w:color="C9D8CC" w:sz="2"/>
+            </w:tcBorders>
+            <w:tcMar>
+              <w:top w:type="dxa" w:w="70"/>
+              <w:left w:type="dxa" w:w="110"/>
+              <w:bottom w:type="dxa" w:w="70"/>
+              <w:right w:type="dxa" w:w="110"/>
+            </w:tcMar>
+            <w:vAlign w:val="center"/>
+          </w:tcPr>
+          <w:p>
+            <w:pPr>
+              <w:spacing w:after="20" w:line="276"/>
+              <w:jc w:val="left"/>
+            </w:pPr>
+            <w:r>
+              <w:rPr>
+                <w:b w:val="false"/>
+                <w:bCs w:val="false"/>
+                <w:color w:val="1D2B22"/>
+                <w:sz w:val="18"/>
+                <w:szCs w:val="18"/>
+              </w:rPr>
+              <w:t xml:space="preserve">숲해설 LLM ‘숲이’</w:t>
+            </w:r>
+          </w:p>
+        </w:tc>
+        <w:tc>
+          <w:tcPr>
+            <w:tcW w:type="dxa" w:w="3300"/>
+            <w:tcBorders>
+              <w:top w:val="single" w:color="C9D8CC" w:sz="2"/>
+              <w:left w:val="single" w:color="C9D8CC" w:sz="2"/>
+              <w:bottom w:val="single" w:color="C9D8CC" w:sz="2"/>
+              <w:right w:val="single" w:color="C9D8CC" w:sz="2"/>
+            </w:tcBorders>
+            <w:tcMar>
+              <w:top w:type="dxa" w:w="70"/>
+              <w:left w:type="dxa" w:w="110"/>
+              <w:bottom w:type="dxa" w:w="70"/>
+              <w:right w:type="dxa" w:w="110"/>
+            </w:tcMar>
+            <w:vAlign w:val="center"/>
+          </w:tcPr>
+          <w:p>
+            <w:pPr>
+              <w:spacing w:after="20" w:line="276"/>
+              <w:jc w:val="left"/>
+            </w:pPr>
+            <w:r>
+              <w:rPr>
+                <w:b w:val="false"/>
+                <w:bCs w:val="false"/>
+                <w:color w:val="1D2B22"/>
+                <w:sz w:val="18"/>
+                <w:szCs w:val="18"/>
+              </w:rPr>
+              <w:t xml:space="preserve">한국어 sLLM + RAG</w:t>
+            </w:r>
+          </w:p>
+        </w:tc>
+        <w:tc>
+          <w:tcPr>
+            <w:tcW w:type="dxa" w:w="4038"/>
+            <w:tcBorders>
+              <w:top w:val="single" w:color="C9D8CC" w:sz="2"/>
+              <w:left w:val="single" w:color="C9D8CC" w:sz="2"/>
+              <w:bottom w:val="single" w:color="C9D8CC" w:sz="2"/>
+              <w:right w:val="single" w:color="C9D8CC" w:sz="2"/>
+            </w:tcBorders>
+            <w:tcMar>
+              <w:top w:type="dxa" w:w="70"/>
+              <w:left w:type="dxa" w:w="110"/>
+              <w:bottom w:type="dxa" w:w="70"/>
+              <w:right w:type="dxa" w:w="110"/>
+            </w:tcMar>
+            <w:vAlign w:val="center"/>
+          </w:tcPr>
+          <w:p>
+            <w:pPr>
+              <w:spacing w:after="20" w:line="276"/>
+              <w:jc w:val="left"/>
+            </w:pPr>
+            <w:r>
+              <w:rPr>
+                <w:b w:val="false"/>
+                <w:bCs w:val="false"/>
+                <w:color w:val="1D2B22"/>
+                <w:sz w:val="18"/>
+                <w:szCs w:val="18"/>
+              </w:rPr>
+              <w:t xml:space="preserve">질문·위치 → 공공 지식베이스 근거 답변(4개 언어)</w:t>
             </w:r>
           </w:p>
         </w:tc>
@@ -7024,15 +5544,942 @@
     </w:tbl>
     <w:p>
       <w:pPr>
+        <w:pStyle w:val="Heading2"/>
+        <w:spacing w:after="120" w:before="240"/>
+      </w:pPr>
+      <w:r>
+        <w:rPr>
+          <w:b/>
+          <w:bCs/>
+          <w:color w:val="2D6A4F"/>
+        </w:rPr>
+        <w:t xml:space="preserve">4-4. 시연 시나리오 (발표평가 시연 순서)</w:t>
+      </w:r>
+    </w:p>
+    <w:tbl>
+      <w:tblPr>
+        <w:tblW w:type="dxa" w:w="9638"/>
+        <w:tblBorders>
+          <w:top w:val="single" w:color="auto" w:sz="4"/>
+          <w:left w:val="single" w:color="auto" w:sz="4"/>
+          <w:bottom w:val="single" w:color="auto" w:sz="4"/>
+          <w:right w:val="single" w:color="auto" w:sz="4"/>
+          <w:insideH w:val="single" w:color="auto" w:sz="4"/>
+          <w:insideV w:val="single" w:color="auto" w:sz="4"/>
+        </w:tblBorders>
+      </w:tblPr>
+      <w:tblGrid>
+        <w:gridCol w:w="900"/>
+        <w:gridCol w:w="2900"/>
+        <w:gridCol w:w="5838"/>
+      </w:tblGrid>
+      <w:tr>
+        <w:trPr>
+          <w:tblHeader/>
+        </w:trPr>
+        <w:tc>
+          <w:tcPr>
+            <w:tcW w:type="dxa" w:w="900"/>
+            <w:tcBorders>
+              <w:top w:val="single" w:color="C9D8CC" w:sz="2"/>
+              <w:left w:val="single" w:color="C9D8CC" w:sz="2"/>
+              <w:bottom w:val="single" w:color="C9D8CC" w:sz="2"/>
+              <w:right w:val="single" w:color="C9D8CC" w:sz="2"/>
+            </w:tcBorders>
+            <w:shd w:fill="1B4332" w:val="clear"/>
+            <w:tcMar>
+              <w:top w:type="dxa" w:w="70"/>
+              <w:left w:type="dxa" w:w="110"/>
+              <w:bottom w:type="dxa" w:w="70"/>
+              <w:right w:type="dxa" w:w="110"/>
+            </w:tcMar>
+            <w:vAlign w:val="center"/>
+          </w:tcPr>
+          <w:p>
+            <w:pPr>
+              <w:spacing w:after="20" w:line="276"/>
+              <w:jc w:val="center"/>
+            </w:pPr>
+            <w:r>
+              <w:rPr>
+                <w:b/>
+                <w:bCs/>
+                <w:color w:val="FFFFFF"/>
+                <w:sz w:val="18"/>
+                <w:szCs w:val="18"/>
+              </w:rPr>
+              <w:t xml:space="preserve">순서</w:t>
+            </w:r>
+          </w:p>
+        </w:tc>
+        <w:tc>
+          <w:tcPr>
+            <w:tcW w:type="dxa" w:w="2900"/>
+            <w:tcBorders>
+              <w:top w:val="single" w:color="C9D8CC" w:sz="2"/>
+              <w:left w:val="single" w:color="C9D8CC" w:sz="2"/>
+              <w:bottom w:val="single" w:color="C9D8CC" w:sz="2"/>
+              <w:right w:val="single" w:color="C9D8CC" w:sz="2"/>
+            </w:tcBorders>
+            <w:shd w:fill="1B4332" w:val="clear"/>
+            <w:tcMar>
+              <w:top w:type="dxa" w:w="70"/>
+              <w:left w:type="dxa" w:w="110"/>
+              <w:bottom w:type="dxa" w:w="70"/>
+              <w:right w:type="dxa" w:w="110"/>
+            </w:tcMar>
+            <w:vAlign w:val="center"/>
+          </w:tcPr>
+          <w:p>
+            <w:pPr>
+              <w:spacing w:after="20" w:line="276"/>
+              <w:jc w:val="center"/>
+            </w:pPr>
+            <w:r>
+              <w:rPr>
+                <w:b/>
+                <w:bCs/>
+                <w:color w:val="FFFFFF"/>
+                <w:sz w:val="18"/>
+                <w:szCs w:val="18"/>
+              </w:rPr>
+              <w:t xml:space="preserve">화면</w:t>
+            </w:r>
+          </w:p>
+        </w:tc>
+        <w:tc>
+          <w:tcPr>
+            <w:tcW w:type="dxa" w:w="5838"/>
+            <w:tcBorders>
+              <w:top w:val="single" w:color="C9D8CC" w:sz="2"/>
+              <w:left w:val="single" w:color="C9D8CC" w:sz="2"/>
+              <w:bottom w:val="single" w:color="C9D8CC" w:sz="2"/>
+              <w:right w:val="single" w:color="C9D8CC" w:sz="2"/>
+            </w:tcBorders>
+            <w:shd w:fill="1B4332" w:val="clear"/>
+            <w:tcMar>
+              <w:top w:type="dxa" w:w="70"/>
+              <w:left w:type="dxa" w:w="110"/>
+              <w:bottom w:type="dxa" w:w="70"/>
+              <w:right w:type="dxa" w:w="110"/>
+            </w:tcMar>
+            <w:vAlign w:val="center"/>
+          </w:tcPr>
+          <w:p>
+            <w:pPr>
+              <w:spacing w:after="20" w:line="276"/>
+              <w:jc w:val="center"/>
+            </w:pPr>
+            <w:r>
+              <w:rPr>
+                <w:b/>
+                <w:bCs/>
+                <w:color w:val="FFFFFF"/>
+                <w:sz w:val="18"/>
+                <w:szCs w:val="18"/>
+              </w:rPr>
+              <w:t xml:space="preserve">시연 내용</w:t>
+            </w:r>
+          </w:p>
+        </w:tc>
+      </w:tr>
+      <w:tr>
+        <w:tc>
+          <w:tcPr>
+            <w:tcW w:type="dxa" w:w="900"/>
+            <w:tcBorders>
+              <w:top w:val="single" w:color="C9D8CC" w:sz="2"/>
+              <w:left w:val="single" w:color="C9D8CC" w:sz="2"/>
+              <w:bottom w:val="single" w:color="C9D8CC" w:sz="2"/>
+              <w:right w:val="single" w:color="C9D8CC" w:sz="2"/>
+            </w:tcBorders>
+            <w:tcMar>
+              <w:top w:type="dxa" w:w="70"/>
+              <w:left w:type="dxa" w:w="110"/>
+              <w:bottom w:type="dxa" w:w="70"/>
+              <w:right w:type="dxa" w:w="110"/>
+            </w:tcMar>
+            <w:vAlign w:val="center"/>
+          </w:tcPr>
+          <w:p>
+            <w:pPr>
+              <w:spacing w:after="20" w:line="276"/>
+              <w:jc w:val="left"/>
+            </w:pPr>
+            <w:r>
+              <w:rPr>
+                <w:b w:val="false"/>
+                <w:bCs w:val="false"/>
+                <w:color w:val="1D2B22"/>
+                <w:sz w:val="18"/>
+                <w:szCs w:val="18"/>
+              </w:rPr>
+              <w:t xml:space="preserve">1</w:t>
+            </w:r>
+          </w:p>
+        </w:tc>
+        <w:tc>
+          <w:tcPr>
+            <w:tcW w:type="dxa" w:w="2900"/>
+            <w:tcBorders>
+              <w:top w:val="single" w:color="C9D8CC" w:sz="2"/>
+              <w:left w:val="single" w:color="C9D8CC" w:sz="2"/>
+              <w:bottom w:val="single" w:color="C9D8CC" w:sz="2"/>
+              <w:right w:val="single" w:color="C9D8CC" w:sz="2"/>
+            </w:tcBorders>
+            <w:tcMar>
+              <w:top w:type="dxa" w:w="70"/>
+              <w:left w:type="dxa" w:w="110"/>
+              <w:bottom w:type="dxa" w:w="70"/>
+              <w:right w:type="dxa" w:w="110"/>
+            </w:tcMar>
+            <w:vAlign w:val="center"/>
+          </w:tcPr>
+          <w:p>
+            <w:pPr>
+              <w:spacing w:after="20" w:line="276"/>
+              <w:jc w:val="left"/>
+            </w:pPr>
+            <w:r>
+              <w:rPr>
+                <w:b w:val="false"/>
+                <w:bCs w:val="false"/>
+                <w:color w:val="1D2B22"/>
+                <w:sz w:val="18"/>
+                <w:szCs w:val="18"/>
+              </w:rPr>
+              <w:t xml:space="preserve">홈</w:t>
+            </w:r>
+          </w:p>
+        </w:tc>
+        <w:tc>
+          <w:tcPr>
+            <w:tcW w:type="dxa" w:w="5838"/>
+            <w:tcBorders>
+              <w:top w:val="single" w:color="C9D8CC" w:sz="2"/>
+              <w:left w:val="single" w:color="C9D8CC" w:sz="2"/>
+              <w:bottom w:val="single" w:color="C9D8CC" w:sz="2"/>
+              <w:right w:val="single" w:color="C9D8CC" w:sz="2"/>
+            </w:tcBorders>
+            <w:tcMar>
+              <w:top w:type="dxa" w:w="70"/>
+              <w:left w:type="dxa" w:w="110"/>
+              <w:bottom w:type="dxa" w:w="70"/>
+              <w:right w:type="dxa" w:w="110"/>
+            </w:tcMar>
+            <w:vAlign w:val="center"/>
+          </w:tcPr>
+          <w:p>
+            <w:pPr>
+              <w:spacing w:after="20" w:line="276"/>
+              <w:jc w:val="left"/>
+            </w:pPr>
+            <w:r>
+              <w:rPr>
+                <w:b w:val="false"/>
+                <w:bCs w:val="false"/>
+                <w:color w:val="1D2B22"/>
+                <w:sz w:val="18"/>
+                <w:szCs w:val="18"/>
+              </w:rPr>
+              <w:t xml:space="preserve">오늘의 산행지수 82점 — 산불위험·산사태·산악기상·일몰 4개 공공데이터가 한 점수로 융합되는 과정 설명</w:t>
+            </w:r>
+          </w:p>
+        </w:tc>
+      </w:tr>
+      <w:tr>
+        <w:tc>
+          <w:tcPr>
+            <w:tcW w:type="dxa" w:w="900"/>
+            <w:tcBorders>
+              <w:top w:val="single" w:color="C9D8CC" w:sz="2"/>
+              <w:left w:val="single" w:color="C9D8CC" w:sz="2"/>
+              <w:bottom w:val="single" w:color="C9D8CC" w:sz="2"/>
+              <w:right w:val="single" w:color="C9D8CC" w:sz="2"/>
+            </w:tcBorders>
+            <w:tcMar>
+              <w:top w:type="dxa" w:w="70"/>
+              <w:left w:type="dxa" w:w="110"/>
+              <w:bottom w:type="dxa" w:w="70"/>
+              <w:right w:type="dxa" w:w="110"/>
+            </w:tcMar>
+            <w:vAlign w:val="center"/>
+          </w:tcPr>
+          <w:p>
+            <w:pPr>
+              <w:spacing w:after="20" w:line="276"/>
+              <w:jc w:val="left"/>
+            </w:pPr>
+            <w:r>
+              <w:rPr>
+                <w:b w:val="false"/>
+                <w:bCs w:val="false"/>
+                <w:color w:val="1D2B22"/>
+                <w:sz w:val="18"/>
+                <w:szCs w:val="18"/>
+              </w:rPr>
+              <w:t xml:space="preserve">2</w:t>
+            </w:r>
+          </w:p>
+        </w:tc>
+        <w:tc>
+          <w:tcPr>
+            <w:tcW w:type="dxa" w:w="2900"/>
+            <w:tcBorders>
+              <w:top w:val="single" w:color="C9D8CC" w:sz="2"/>
+              <w:left w:val="single" w:color="C9D8CC" w:sz="2"/>
+              <w:bottom w:val="single" w:color="C9D8CC" w:sz="2"/>
+              <w:right w:val="single" w:color="C9D8CC" w:sz="2"/>
+            </w:tcBorders>
+            <w:tcMar>
+              <w:top w:type="dxa" w:w="70"/>
+              <w:left w:type="dxa" w:w="110"/>
+              <w:bottom w:type="dxa" w:w="70"/>
+              <w:right w:type="dxa" w:w="110"/>
+            </w:tcMar>
+            <w:vAlign w:val="center"/>
+          </w:tcPr>
+          <w:p>
+            <w:pPr>
+              <w:spacing w:after="20" w:line="276"/>
+              <w:jc w:val="left"/>
+            </w:pPr>
+            <w:r>
+              <w:rPr>
+                <w:b w:val="false"/>
+                <w:bCs w:val="false"/>
+                <w:color w:val="1D2B22"/>
+                <w:sz w:val="18"/>
+                <w:szCs w:val="18"/>
+              </w:rPr>
+              <w:t xml:space="preserve">홈 → AI 추천</w:t>
+            </w:r>
+          </w:p>
+        </w:tc>
+        <w:tc>
+          <w:tcPr>
+            <w:tcW w:type="dxa" w:w="5838"/>
+            <w:tcBorders>
+              <w:top w:val="single" w:color="C9D8CC" w:sz="2"/>
+              <w:left w:val="single" w:color="C9D8CC" w:sz="2"/>
+              <w:bottom w:val="single" w:color="C9D8CC" w:sz="2"/>
+              <w:right w:val="single" w:color="C9D8CC" w:sz="2"/>
+            </w:tcBorders>
+            <w:tcMar>
+              <w:top w:type="dxa" w:w="70"/>
+              <w:left w:type="dxa" w:w="110"/>
+              <w:bottom w:type="dxa" w:w="70"/>
+              <w:right w:type="dxa" w:w="110"/>
+            </w:tcMar>
+            <w:vAlign w:val="center"/>
+          </w:tcPr>
+          <w:p>
+            <w:pPr>
+              <w:spacing w:after="20" w:line="276"/>
+              <w:jc w:val="left"/>
+            </w:pPr>
+            <w:r>
+              <w:rPr>
+                <w:b w:val="false"/>
+                <w:bCs w:val="false"/>
+                <w:color w:val="1D2B22"/>
+                <w:sz w:val="18"/>
+                <w:szCs w:val="18"/>
+              </w:rPr>
+              <w:t xml:space="preserve">사용자 체력(중급)·무릎 주의 이력을 반영한 북한산 백운대 코스 매칭 92% 확인</w:t>
+            </w:r>
+          </w:p>
+        </w:tc>
+      </w:tr>
+      <w:tr>
+        <w:tc>
+          <w:tcPr>
+            <w:tcW w:type="dxa" w:w="900"/>
+            <w:tcBorders>
+              <w:top w:val="single" w:color="C9D8CC" w:sz="2"/>
+              <w:left w:val="single" w:color="C9D8CC" w:sz="2"/>
+              <w:bottom w:val="single" w:color="C9D8CC" w:sz="2"/>
+              <w:right w:val="single" w:color="C9D8CC" w:sz="2"/>
+            </w:tcBorders>
+            <w:tcMar>
+              <w:top w:type="dxa" w:w="70"/>
+              <w:left w:type="dxa" w:w="110"/>
+              <w:bottom w:type="dxa" w:w="70"/>
+              <w:right w:type="dxa" w:w="110"/>
+            </w:tcMar>
+            <w:vAlign w:val="center"/>
+          </w:tcPr>
+          <w:p>
+            <w:pPr>
+              <w:spacing w:after="20" w:line="276"/>
+              <w:jc w:val="left"/>
+            </w:pPr>
+            <w:r>
+              <w:rPr>
+                <w:b w:val="false"/>
+                <w:bCs w:val="false"/>
+                <w:color w:val="1D2B22"/>
+                <w:sz w:val="18"/>
+                <w:szCs w:val="18"/>
+              </w:rPr>
+              <w:t xml:space="preserve">3</w:t>
+            </w:r>
+          </w:p>
+        </w:tc>
+        <w:tc>
+          <w:tcPr>
+            <w:tcW w:type="dxa" w:w="2900"/>
+            <w:tcBorders>
+              <w:top w:val="single" w:color="C9D8CC" w:sz="2"/>
+              <w:left w:val="single" w:color="C9D8CC" w:sz="2"/>
+              <w:bottom w:val="single" w:color="C9D8CC" w:sz="2"/>
+              <w:right w:val="single" w:color="C9D8CC" w:sz="2"/>
+            </w:tcBorders>
+            <w:tcMar>
+              <w:top w:type="dxa" w:w="70"/>
+              <w:left w:type="dxa" w:w="110"/>
+              <w:bottom w:type="dxa" w:w="70"/>
+              <w:right w:type="dxa" w:w="110"/>
+            </w:tcMar>
+            <w:vAlign w:val="center"/>
+          </w:tcPr>
+          <w:p>
+            <w:pPr>
+              <w:spacing w:after="20" w:line="276"/>
+              <w:jc w:val="left"/>
+            </w:pPr>
+            <w:r>
+              <w:rPr>
+                <w:b w:val="false"/>
+                <w:bCs w:val="false"/>
+                <w:color w:val="1D2B22"/>
+                <w:sz w:val="18"/>
+                <w:szCs w:val="18"/>
+              </w:rPr>
+              <w:t xml:space="preserve">산행 모드</w:t>
+            </w:r>
+          </w:p>
+        </w:tc>
+        <w:tc>
+          <w:tcPr>
+            <w:tcW w:type="dxa" w:w="5838"/>
+            <w:tcBorders>
+              <w:top w:val="single" w:color="C9D8CC" w:sz="2"/>
+              <w:left w:val="single" w:color="C9D8CC" w:sz="2"/>
+              <w:bottom w:val="single" w:color="C9D8CC" w:sz="2"/>
+              <w:right w:val="single" w:color="C9D8CC" w:sz="2"/>
+            </w:tcBorders>
+            <w:tcMar>
+              <w:top w:type="dxa" w:w="70"/>
+              <w:left w:type="dxa" w:w="110"/>
+              <w:bottom w:type="dxa" w:w="70"/>
+              <w:right w:type="dxa" w:w="110"/>
+            </w:tcMar>
+            <w:vAlign w:val="center"/>
+          </w:tcPr>
+          <w:p>
+            <w:pPr>
+              <w:spacing w:after="20" w:line="276"/>
+              <w:jc w:val="left"/>
+            </w:pPr>
+            <w:r>
+              <w:rPr>
+                <w:b w:val="false"/>
+                <w:bCs w:val="false"/>
+                <w:color w:val="1D2B22"/>
+                <w:sz w:val="18"/>
+                <w:szCs w:val="18"/>
+              </w:rPr>
+              <w:t xml:space="preserve">등산로 위 실시간 위치·국가지점번호 표시, 300m 앞 낙석 구간 경고 푸시 수신</w:t>
+            </w:r>
+          </w:p>
+        </w:tc>
+      </w:tr>
+      <w:tr>
+        <w:tc>
+          <w:tcPr>
+            <w:tcW w:type="dxa" w:w="900"/>
+            <w:tcBorders>
+              <w:top w:val="single" w:color="C9D8CC" w:sz="2"/>
+              <w:left w:val="single" w:color="C9D8CC" w:sz="2"/>
+              <w:bottom w:val="single" w:color="C9D8CC" w:sz="2"/>
+              <w:right w:val="single" w:color="C9D8CC" w:sz="2"/>
+            </w:tcBorders>
+            <w:tcMar>
+              <w:top w:type="dxa" w:w="70"/>
+              <w:left w:type="dxa" w:w="110"/>
+              <w:bottom w:type="dxa" w:w="70"/>
+              <w:right w:type="dxa" w:w="110"/>
+            </w:tcMar>
+            <w:vAlign w:val="center"/>
+          </w:tcPr>
+          <w:p>
+            <w:pPr>
+              <w:spacing w:after="20" w:line="276"/>
+              <w:jc w:val="left"/>
+            </w:pPr>
+            <w:r>
+              <w:rPr>
+                <w:b w:val="false"/>
+                <w:bCs w:val="false"/>
+                <w:color w:val="1D2B22"/>
+                <w:sz w:val="18"/>
+                <w:szCs w:val="18"/>
+              </w:rPr>
+              <w:t xml:space="preserve">4</w:t>
+            </w:r>
+          </w:p>
+        </w:tc>
+        <w:tc>
+          <w:tcPr>
+            <w:tcW w:type="dxa" w:w="2900"/>
+            <w:tcBorders>
+              <w:top w:val="single" w:color="C9D8CC" w:sz="2"/>
+              <w:left w:val="single" w:color="C9D8CC" w:sz="2"/>
+              <w:bottom w:val="single" w:color="C9D8CC" w:sz="2"/>
+              <w:right w:val="single" w:color="C9D8CC" w:sz="2"/>
+            </w:tcBorders>
+            <w:tcMar>
+              <w:top w:type="dxa" w:w="70"/>
+              <w:left w:type="dxa" w:w="110"/>
+              <w:bottom w:type="dxa" w:w="70"/>
+              <w:right w:type="dxa" w:w="110"/>
+            </w:tcMar>
+            <w:vAlign w:val="center"/>
+          </w:tcPr>
+          <w:p>
+            <w:pPr>
+              <w:spacing w:after="20" w:line="276"/>
+              <w:jc w:val="left"/>
+            </w:pPr>
+            <w:r>
+              <w:rPr>
+                <w:b w:val="false"/>
+                <w:bCs w:val="false"/>
+                <w:color w:val="1D2B22"/>
+                <w:sz w:val="18"/>
+                <w:szCs w:val="18"/>
+              </w:rPr>
+              <w:t xml:space="preserve">AI동무</w:t>
+            </w:r>
+          </w:p>
+        </w:tc>
+        <w:tc>
+          <w:tcPr>
+            <w:tcW w:type="dxa" w:w="5838"/>
+            <w:tcBorders>
+              <w:top w:val="single" w:color="C9D8CC" w:sz="2"/>
+              <w:left w:val="single" w:color="C9D8CC" w:sz="2"/>
+              <w:bottom w:val="single" w:color="C9D8CC" w:sz="2"/>
+              <w:right w:val="single" w:color="C9D8CC" w:sz="2"/>
+            </w:tcBorders>
+            <w:tcMar>
+              <w:top w:type="dxa" w:w="70"/>
+              <w:left w:type="dxa" w:w="110"/>
+              <w:bottom w:type="dxa" w:w="70"/>
+              <w:right w:type="dxa" w:w="110"/>
+            </w:tcMar>
+            <w:vAlign w:val="center"/>
+          </w:tcPr>
+          <w:p>
+            <w:pPr>
+              <w:spacing w:after="20" w:line="276"/>
+              <w:jc w:val="left"/>
+            </w:pPr>
+            <w:r>
+              <w:rPr>
+                <w:b w:val="false"/>
+                <w:bCs w:val="false"/>
+                <w:color w:val="1D2B22"/>
+                <w:sz w:val="18"/>
+                <w:szCs w:val="18"/>
+              </w:rPr>
+              <w:t xml:space="preserve">버섯 사진 촬영 → 개나리광대버섯(맹독성) 87% 경고 — 비행기모드(오프라인)에서 재시연</w:t>
+            </w:r>
+          </w:p>
+        </w:tc>
+      </w:tr>
+      <w:tr>
+        <w:tc>
+          <w:tcPr>
+            <w:tcW w:type="dxa" w:w="900"/>
+            <w:tcBorders>
+              <w:top w:val="single" w:color="C9D8CC" w:sz="2"/>
+              <w:left w:val="single" w:color="C9D8CC" w:sz="2"/>
+              <w:bottom w:val="single" w:color="C9D8CC" w:sz="2"/>
+              <w:right w:val="single" w:color="C9D8CC" w:sz="2"/>
+            </w:tcBorders>
+            <w:tcMar>
+              <w:top w:type="dxa" w:w="70"/>
+              <w:left w:type="dxa" w:w="110"/>
+              <w:bottom w:type="dxa" w:w="70"/>
+              <w:right w:type="dxa" w:w="110"/>
+            </w:tcMar>
+            <w:vAlign w:val="center"/>
+          </w:tcPr>
+          <w:p>
+            <w:pPr>
+              <w:spacing w:after="20" w:line="276"/>
+              <w:jc w:val="left"/>
+            </w:pPr>
+            <w:r>
+              <w:rPr>
+                <w:b w:val="false"/>
+                <w:bCs w:val="false"/>
+                <w:color w:val="1D2B22"/>
+                <w:sz w:val="18"/>
+                <w:szCs w:val="18"/>
+              </w:rPr>
+              <w:t xml:space="preserve">5</w:t>
+            </w:r>
+          </w:p>
+        </w:tc>
+        <w:tc>
+          <w:tcPr>
+            <w:tcW w:type="dxa" w:w="2900"/>
+            <w:tcBorders>
+              <w:top w:val="single" w:color="C9D8CC" w:sz="2"/>
+              <w:left w:val="single" w:color="C9D8CC" w:sz="2"/>
+              <w:bottom w:val="single" w:color="C9D8CC" w:sz="2"/>
+              <w:right w:val="single" w:color="C9D8CC" w:sz="2"/>
+            </w:tcBorders>
+            <w:tcMar>
+              <w:top w:type="dxa" w:w="70"/>
+              <w:left w:type="dxa" w:w="110"/>
+              <w:bottom w:type="dxa" w:w="70"/>
+              <w:right w:type="dxa" w:w="110"/>
+            </w:tcMar>
+            <w:vAlign w:val="center"/>
+          </w:tcPr>
+          <w:p>
+            <w:pPr>
+              <w:spacing w:after="20" w:line="276"/>
+              <w:jc w:val="left"/>
+            </w:pPr>
+            <w:r>
+              <w:rPr>
+                <w:b w:val="false"/>
+                <w:bCs w:val="false"/>
+                <w:color w:val="1D2B22"/>
+                <w:sz w:val="18"/>
+                <w:szCs w:val="18"/>
+              </w:rPr>
+              <w:t xml:space="preserve">SOS</w:t>
+            </w:r>
+          </w:p>
+        </w:tc>
+        <w:tc>
+          <w:tcPr>
+            <w:tcW w:type="dxa" w:w="5838"/>
+            <w:tcBorders>
+              <w:top w:val="single" w:color="C9D8CC" w:sz="2"/>
+              <w:left w:val="single" w:color="C9D8CC" w:sz="2"/>
+              <w:bottom w:val="single" w:color="C9D8CC" w:sz="2"/>
+              <w:right w:val="single" w:color="C9D8CC" w:sz="2"/>
+            </w:tcBorders>
+            <w:tcMar>
+              <w:top w:type="dxa" w:w="70"/>
+              <w:left w:type="dxa" w:w="110"/>
+              <w:bottom w:type="dxa" w:w="70"/>
+              <w:right w:type="dxa" w:w="110"/>
+            </w:tcMar>
+            <w:vAlign w:val="center"/>
+          </w:tcPr>
+          <w:p>
+            <w:pPr>
+              <w:spacing w:after="20" w:line="276"/>
+              <w:jc w:val="left"/>
+            </w:pPr>
+            <w:r>
+              <w:rPr>
+                <w:b w:val="false"/>
+                <w:bCs w:val="false"/>
+                <w:color w:val="1D2B22"/>
+                <w:sz w:val="18"/>
+                <w:szCs w:val="18"/>
+              </w:rPr>
+              <w:t xml:space="preserve">SOS 3초 길게 누르기 → 국가지점번호·좌표가 119 메시지로 구성되는 화면 확인</w:t>
+            </w:r>
+          </w:p>
+        </w:tc>
+      </w:tr>
+      <w:tr>
+        <w:tc>
+          <w:tcPr>
+            <w:tcW w:type="dxa" w:w="900"/>
+            <w:tcBorders>
+              <w:top w:val="single" w:color="C9D8CC" w:sz="2"/>
+              <w:left w:val="single" w:color="C9D8CC" w:sz="2"/>
+              <w:bottom w:val="single" w:color="C9D8CC" w:sz="2"/>
+              <w:right w:val="single" w:color="C9D8CC" w:sz="2"/>
+            </w:tcBorders>
+            <w:tcMar>
+              <w:top w:type="dxa" w:w="70"/>
+              <w:left w:type="dxa" w:w="110"/>
+              <w:bottom w:type="dxa" w:w="70"/>
+              <w:right w:type="dxa" w:w="110"/>
+            </w:tcMar>
+            <w:vAlign w:val="center"/>
+          </w:tcPr>
+          <w:p>
+            <w:pPr>
+              <w:spacing w:after="20" w:line="276"/>
+              <w:jc w:val="left"/>
+            </w:pPr>
+            <w:r>
+              <w:rPr>
+                <w:b w:val="false"/>
+                <w:bCs w:val="false"/>
+                <w:color w:val="1D2B22"/>
+                <w:sz w:val="18"/>
+                <w:szCs w:val="18"/>
+              </w:rPr>
+              <w:t xml:space="preserve">6</w:t>
+            </w:r>
+          </w:p>
+        </w:tc>
+        <w:tc>
+          <w:tcPr>
+            <w:tcW w:type="dxa" w:w="2900"/>
+            <w:tcBorders>
+              <w:top w:val="single" w:color="C9D8CC" w:sz="2"/>
+              <w:left w:val="single" w:color="C9D8CC" w:sz="2"/>
+              <w:bottom w:val="single" w:color="C9D8CC" w:sz="2"/>
+              <w:right w:val="single" w:color="C9D8CC" w:sz="2"/>
+            </w:tcBorders>
+            <w:tcMar>
+              <w:top w:type="dxa" w:w="70"/>
+              <w:left w:type="dxa" w:w="110"/>
+              <w:bottom w:type="dxa" w:w="70"/>
+              <w:right w:type="dxa" w:w="110"/>
+            </w:tcMar>
+            <w:vAlign w:val="center"/>
+          </w:tcPr>
+          <w:p>
+            <w:pPr>
+              <w:spacing w:after="20" w:line="276"/>
+              <w:jc w:val="left"/>
+            </w:pPr>
+            <w:r>
+              <w:rPr>
+                <w:b w:val="false"/>
+                <w:bCs w:val="false"/>
+                <w:color w:val="1D2B22"/>
+                <w:sz w:val="18"/>
+                <w:szCs w:val="18"/>
+              </w:rPr>
+              <w:t xml:space="preserve">관제 웹</w:t>
+            </w:r>
+          </w:p>
+        </w:tc>
+        <w:tc>
+          <w:tcPr>
+            <w:tcW w:type="dxa" w:w="5838"/>
+            <w:tcBorders>
+              <w:top w:val="single" w:color="C9D8CC" w:sz="2"/>
+              <w:left w:val="single" w:color="C9D8CC" w:sz="2"/>
+              <w:bottom w:val="single" w:color="C9D8CC" w:sz="2"/>
+              <w:right w:val="single" w:color="C9D8CC" w:sz="2"/>
+            </w:tcBorders>
+            <w:tcMar>
+              <w:top w:type="dxa" w:w="70"/>
+              <w:left w:type="dxa" w:w="110"/>
+              <w:bottom w:type="dxa" w:w="70"/>
+              <w:right w:type="dxa" w:w="110"/>
+            </w:tcMar>
+            <w:vAlign w:val="center"/>
+          </w:tcPr>
+          <w:p>
+            <w:pPr>
+              <w:spacing w:after="20" w:line="276"/>
+              <w:jc w:val="left"/>
+            </w:pPr>
+            <w:r>
+              <w:rPr>
+                <w:b w:val="false"/>
+                <w:bCs w:val="false"/>
+                <w:color w:val="1D2B22"/>
+                <w:sz w:val="18"/>
+                <w:szCs w:val="18"/>
+              </w:rPr>
+              <w:t xml:space="preserve">방금 발생시킨 SOS가 대시보드에 실시간 표출 — 구조거점 매칭·헬기 경로 확인</w:t>
+            </w:r>
+          </w:p>
+        </w:tc>
+      </w:tr>
+      <w:tr>
+        <w:tc>
+          <w:tcPr>
+            <w:tcW w:type="dxa" w:w="900"/>
+            <w:tcBorders>
+              <w:top w:val="single" w:color="C9D8CC" w:sz="2"/>
+              <w:left w:val="single" w:color="C9D8CC" w:sz="2"/>
+              <w:bottom w:val="single" w:color="C9D8CC" w:sz="2"/>
+              <w:right w:val="single" w:color="C9D8CC" w:sz="2"/>
+            </w:tcBorders>
+            <w:tcMar>
+              <w:top w:type="dxa" w:w="70"/>
+              <w:left w:type="dxa" w:w="110"/>
+              <w:bottom w:type="dxa" w:w="70"/>
+              <w:right w:type="dxa" w:w="110"/>
+            </w:tcMar>
+            <w:vAlign w:val="center"/>
+          </w:tcPr>
+          <w:p>
+            <w:pPr>
+              <w:spacing w:after="20" w:line="276"/>
+              <w:jc w:val="left"/>
+            </w:pPr>
+            <w:r>
+              <w:rPr>
+                <w:b w:val="false"/>
+                <w:bCs w:val="false"/>
+                <w:color w:val="1D2B22"/>
+                <w:sz w:val="18"/>
+                <w:szCs w:val="18"/>
+              </w:rPr>
+              <w:t xml:space="preserve">7</w:t>
+            </w:r>
+          </w:p>
+        </w:tc>
+        <w:tc>
+          <w:tcPr>
+            <w:tcW w:type="dxa" w:w="2900"/>
+            <w:tcBorders>
+              <w:top w:val="single" w:color="C9D8CC" w:sz="2"/>
+              <w:left w:val="single" w:color="C9D8CC" w:sz="2"/>
+              <w:bottom w:val="single" w:color="C9D8CC" w:sz="2"/>
+              <w:right w:val="single" w:color="C9D8CC" w:sz="2"/>
+            </w:tcBorders>
+            <w:tcMar>
+              <w:top w:type="dxa" w:w="70"/>
+              <w:left w:type="dxa" w:w="110"/>
+              <w:bottom w:type="dxa" w:w="70"/>
+              <w:right w:type="dxa" w:w="110"/>
+            </w:tcMar>
+            <w:vAlign w:val="center"/>
+          </w:tcPr>
+          <w:p>
+            <w:pPr>
+              <w:spacing w:after="20" w:line="276"/>
+              <w:jc w:val="left"/>
+            </w:pPr>
+            <w:r>
+              <w:rPr>
+                <w:b w:val="false"/>
+                <w:bCs w:val="false"/>
+                <w:color w:val="1D2B22"/>
+                <w:sz w:val="18"/>
+                <w:szCs w:val="18"/>
+              </w:rPr>
+              <w:t xml:space="preserve">마이</w:t>
+            </w:r>
+          </w:p>
+        </w:tc>
+        <w:tc>
+          <w:tcPr>
+            <w:tcW w:type="dxa" w:w="5838"/>
+            <w:tcBorders>
+              <w:top w:val="single" w:color="C9D8CC" w:sz="2"/>
+              <w:left w:val="single" w:color="C9D8CC" w:sz="2"/>
+              <w:bottom w:val="single" w:color="C9D8CC" w:sz="2"/>
+              <w:right w:val="single" w:color="C9D8CC" w:sz="2"/>
+            </w:tcBorders>
+            <w:tcMar>
+              <w:top w:type="dxa" w:w="70"/>
+              <w:left w:type="dxa" w:w="110"/>
+              <w:bottom w:type="dxa" w:w="70"/>
+              <w:right w:type="dxa" w:w="110"/>
+            </w:tcMar>
+            <w:vAlign w:val="center"/>
+          </w:tcPr>
+          <w:p>
+            <w:pPr>
+              <w:spacing w:after="20" w:line="276"/>
+              <w:jc w:val="left"/>
+            </w:pPr>
+            <w:r>
+              <w:rPr>
+                <w:b w:val="false"/>
+                <w:bCs w:val="false"/>
+                <w:color w:val="1D2B22"/>
+                <w:sz w:val="18"/>
+                <w:szCs w:val="18"/>
+              </w:rPr>
+              <w:t xml:space="preserve">산행 리포트·탄소흡수 기여·1일 안심보험(990원) 가입 흐름</w:t>
+            </w:r>
+          </w:p>
+        </w:tc>
+      </w:tr>
+    </w:tbl>
+    <w:p>
+      <w:pPr>
+        <w:spacing w:before="120"/>
+      </w:pPr>
+      <w:r>
+        <w:rPr>
+          <w:b/>
+          <w:bCs/>
+          <w:color w:val="1D2B22"/>
+        </w:rPr>
+        <w:t xml:space="preserve">기술 스택: </w:t>
+      </w:r>
+      <w:r>
+        <w:rPr>
+          <w:color w:val="1D2B22"/>
+          <w:sz w:val="18"/>
+          <w:szCs w:val="18"/>
+        </w:rPr>
+        <w:t xml:space="preserve">Flutter(앱) · React(관제 웹) · FastAPI · PostGIS 공간DB · Airflow ETL · AWS(EKS) · FCM/APNs 푸시 · WebSocket 실시간 스트림 · 온디바이스 TFLite</w:t>
+      </w:r>
+    </w:p>
+    <w:p>
+      <w:r>
+        <w:br w:type="page"/>
+      </w:r>
+    </w:p>
+    <w:p>
+      <w:pPr>
+        <w:pStyle w:val="Heading1"/>
+        <w:pBdr>
+          <w:bottom w:val="single" w:color="40916C" w:sz="10" w:space="2"/>
+        </w:pBdr>
+        <w:spacing w:after="160" w:before="360"/>
+      </w:pPr>
+      <w:r>
+        <w:rPr>
+          <w:b/>
+          <w:bCs/>
+          <w:color w:val="1B4332"/>
+        </w:rPr>
+        <w:t xml:space="preserve">5. 발전 가능성</w:t>
+      </w:r>
+    </w:p>
+    <w:p>
+      <w:pPr>
+        <w:pStyle w:val="Heading2"/>
+        <w:spacing w:after="120" w:before="240"/>
+      </w:pPr>
+      <w:r>
+        <w:rPr>
+          <w:b/>
+          <w:bCs/>
+          <w:color w:val="2D6A4F"/>
+        </w:rPr>
+        <w:t xml:space="preserve">5-1. 시장 규모와 기회</w:t>
+      </w:r>
+    </w:p>
+    <w:p>
+      <w:pPr>
         <w:spacing w:after="80" w:before="80"/>
         <w:jc w:val="center"/>
       </w:pPr>
       <w:r>
         <w:drawing>
           <wp:inline distT="0" distB="0" distL="0" distR="0">
-            <wp:extent cx="5334000" cy="2447925"/>
+            <wp:extent cx="5524500" cy="2466975"/>
             <wp:effectExtent t="0" r="0" b="0" l="0"/>
-            <wp:docPr id="1" name="chart_revenue.png" descr="chart_revenue.png" title="chart_revenue.png"/>
+            <wp:docPr id="1" name="chart_market.png" descr="chart_market.png" title="chart_market.png"/>
             <wp:cNvGraphicFramePr>
               <a:graphicFrameLocks xmlns:a="http://schemas.openxmlformats.org/drawingml/2006/main" noChangeAspect="1"/>
             </wp:cNvGraphicFramePr>
@@ -7055,7 +6502,7 @@
                   <pic:spPr bwMode="auto">
                     <a:xfrm>
                       <a:off x="0" y="0"/>
-                      <a:ext cx="5334000" cy="2447925"/>
+                      <a:ext cx="5524500" cy="2466975"/>
                     </a:xfrm>
                     <a:prstGeom prst="rect">
                       <a:avLst/>
@@ -7070,16 +6517,13 @@
     </w:p>
     <w:p>
       <w:pPr>
-        <w:spacing w:after="200" w:before="20"/>
-        <w:jc w:val="center"/>
-      </w:pPr>
-      <w:r>
-        <w:rPr>
-          <w:color w:val="6B7F72"/>
-          <w:sz w:val="16"/>
-          <w:szCs w:val="16"/>
-        </w:rPr>
-        <w:t xml:space="preserve">가정: 1차년도 MAU 8만(서울·수도권 명산) → 3차년도 90만(전국+인바운드), 유료 전환율 4→6%, B2G 2→10개 기관 · 자체 추정</w:t>
+        <w:spacing w:after="120" w:line="312"/>
+      </w:pPr>
+      <w:r>
+        <w:rPr>
+          <w:color w:val="1D2B22"/>
+        </w:rPr>
+        <w:t xml:space="preserve">등산은 국민 성인 78%가 월 1회 이상 즐기는 압도적 1위 야외활동이며, 코로나 이후 2030 신규 유입과 K-하이킹 인바운드 관광 수요가 더해지고 있습니다. 반면 ‘안전’을 본업으로 하는 디지털 서비스는 공백 — 숲길동무가 첫 번째 주자입니다.</w:t>
       </w:r>
     </w:p>
     <w:p>
@@ -7093,119 +6537,553 @@
           <w:bCs/>
           <w:color w:val="2D6A4F"/>
         </w:rPr>
-        <w:t xml:space="preserve">5-3. 마케팅·사업 활성화 방안</w:t>
-      </w:r>
-    </w:p>
-    <w:p>
-      <w:pPr>
-        <w:pStyle w:val="ListParagraph"/>
-        <w:numPr>
-          <w:ilvl w:val="0"/>
-          <w:numId w:val="2"/>
-        </w:numPr>
-        <w:spacing w:after="80" w:line="300"/>
-      </w:pPr>
-      <w:r>
-        <w:rPr>
-          <w:b/>
-          <w:bCs/>
-          <w:color w:val="1D2B22"/>
-        </w:rPr>
-        <w:t xml:space="preserve">공공 협력 채널: </w:t>
-      </w:r>
-      <w:r>
-        <w:rPr>
-          <w:color w:val="1D2B22"/>
-        </w:rPr>
-        <w:t xml:space="preserve">산림청 ‘숲나들e’·국가숲길 캠페인 연계, 지자체 시범사업(분담금 매칭)으로 초기 신뢰 확보</w:t>
-      </w:r>
-    </w:p>
-    <w:p>
-      <w:pPr>
-        <w:pStyle w:val="ListParagraph"/>
-        <w:numPr>
-          <w:ilvl w:val="0"/>
-          <w:numId w:val="2"/>
-        </w:numPr>
-        <w:spacing w:after="80" w:line="300"/>
-      </w:pPr>
-      <w:r>
-        <w:rPr>
-          <w:b/>
-          <w:bCs/>
-          <w:color w:val="1D2B22"/>
-        </w:rPr>
-        <w:t xml:space="preserve">커뮤니티 침투: </w:t>
-      </w:r>
-      <w:r>
-        <w:rPr>
-          <w:color w:val="1D2B22"/>
-        </w:rPr>
-        <w:t xml:space="preserve">산악회·등산 크루(2030 ‘산스타그램’) 안전 챌린지, 무사고 배지 리워드</w:t>
-      </w:r>
-    </w:p>
-    <w:p>
-      <w:pPr>
-        <w:pStyle w:val="ListParagraph"/>
-        <w:numPr>
-          <w:ilvl w:val="0"/>
-          <w:numId w:val="2"/>
-        </w:numPr>
-        <w:spacing w:after="80" w:line="300"/>
-      </w:pPr>
-      <w:r>
-        <w:rPr>
-          <w:b/>
-          <w:bCs/>
-          <w:color w:val="1D2B22"/>
-        </w:rPr>
-        <w:t xml:space="preserve">제휴 마케팅: </w:t>
-      </w:r>
-      <w:r>
-        <w:rPr>
-          <w:color w:val="1D2B22"/>
-        </w:rPr>
-        <w:t xml:space="preserve">아웃도어 브랜드 멤버십 연동, 보험사 공동 프로모션(가입 시 첫 달 구독 무료)</w:t>
-      </w:r>
-    </w:p>
-    <w:p>
-      <w:pPr>
-        <w:pStyle w:val="ListParagraph"/>
-        <w:numPr>
-          <w:ilvl w:val="0"/>
-          <w:numId w:val="2"/>
-        </w:numPr>
-        <w:spacing w:after="80" w:line="300"/>
-      </w:pPr>
-      <w:r>
-        <w:rPr>
-          <w:b/>
-          <w:bCs/>
-          <w:color w:val="1D2B22"/>
-        </w:rPr>
-        <w:t xml:space="preserve">인바운드: </w:t>
-      </w:r>
-      <w:r>
-        <w:rPr>
-          <w:color w:val="1D2B22"/>
-        </w:rPr>
-        <w:t xml:space="preserve">관광공사·트레킹 여행사 제휴로 다국어 AI 가이드를 외국인 패키지에 번들</w:t>
-      </w:r>
-    </w:p>
-    <w:p>
-      <w:pPr>
-        <w:pStyle w:val="Heading2"/>
-        <w:spacing w:after="120" w:before="240"/>
-      </w:pPr>
-      <w:r>
-        <w:rPr>
-          <w:b/>
-          <w:bCs/>
-          <w:color w:val="2D6A4F"/>
-        </w:rPr>
-        <w:t xml:space="preserve">5-4. 사업화 로드맵</w:t>
-      </w:r>
-    </w:p>
+        <w:t xml:space="preserve">5-2. 수익모델 4축과 매출 전망</w:t>
+      </w:r>
+    </w:p>
+    <w:tbl>
+      <w:tblPr>
+        <w:tblW w:type="dxa" w:w="9638"/>
+        <w:tblBorders>
+          <w:top w:val="single" w:color="auto" w:sz="4"/>
+          <w:left w:val="single" w:color="auto" w:sz="4"/>
+          <w:bottom w:val="single" w:color="auto" w:sz="4"/>
+          <w:right w:val="single" w:color="auto" w:sz="4"/>
+          <w:insideH w:val="single" w:color="auto" w:sz="4"/>
+          <w:insideV w:val="single" w:color="auto" w:sz="4"/>
+        </w:tblBorders>
+      </w:tblPr>
+      <w:tblGrid>
+        <w:gridCol w:w="2200"/>
+        <w:gridCol w:w="4538"/>
+        <w:gridCol w:w="2900"/>
+      </w:tblGrid>
+      <w:tr>
+        <w:trPr>
+          <w:tblHeader/>
+        </w:trPr>
+        <w:tc>
+          <w:tcPr>
+            <w:tcW w:type="dxa" w:w="2200"/>
+            <w:tcBorders>
+              <w:top w:val="single" w:color="C9D8CC" w:sz="2"/>
+              <w:left w:val="single" w:color="C9D8CC" w:sz="2"/>
+              <w:bottom w:val="single" w:color="C9D8CC" w:sz="2"/>
+              <w:right w:val="single" w:color="C9D8CC" w:sz="2"/>
+            </w:tcBorders>
+            <w:shd w:fill="1B4332" w:val="clear"/>
+            <w:tcMar>
+              <w:top w:type="dxa" w:w="70"/>
+              <w:left w:type="dxa" w:w="110"/>
+              <w:bottom w:type="dxa" w:w="70"/>
+              <w:right w:type="dxa" w:w="110"/>
+            </w:tcMar>
+            <w:vAlign w:val="center"/>
+          </w:tcPr>
+          <w:p>
+            <w:pPr>
+              <w:spacing w:after="20" w:line="276"/>
+              <w:jc w:val="center"/>
+            </w:pPr>
+            <w:r>
+              <w:rPr>
+                <w:b/>
+                <w:bCs/>
+                <w:color w:val="FFFFFF"/>
+                <w:sz w:val="18"/>
+                <w:szCs w:val="18"/>
+              </w:rPr>
+              <w:t xml:space="preserve">수익원</w:t>
+            </w:r>
+          </w:p>
+        </w:tc>
+        <w:tc>
+          <w:tcPr>
+            <w:tcW w:type="dxa" w:w="4538"/>
+            <w:tcBorders>
+              <w:top w:val="single" w:color="C9D8CC" w:sz="2"/>
+              <w:left w:val="single" w:color="C9D8CC" w:sz="2"/>
+              <w:bottom w:val="single" w:color="C9D8CC" w:sz="2"/>
+              <w:right w:val="single" w:color="C9D8CC" w:sz="2"/>
+            </w:tcBorders>
+            <w:shd w:fill="1B4332" w:val="clear"/>
+            <w:tcMar>
+              <w:top w:type="dxa" w:w="70"/>
+              <w:left w:type="dxa" w:w="110"/>
+              <w:bottom w:type="dxa" w:w="70"/>
+              <w:right w:type="dxa" w:w="110"/>
+            </w:tcMar>
+            <w:vAlign w:val="center"/>
+          </w:tcPr>
+          <w:p>
+            <w:pPr>
+              <w:spacing w:after="20" w:line="276"/>
+              <w:jc w:val="center"/>
+            </w:pPr>
+            <w:r>
+              <w:rPr>
+                <w:b/>
+                <w:bCs/>
+                <w:color w:val="FFFFFF"/>
+                <w:sz w:val="18"/>
+                <w:szCs w:val="18"/>
+              </w:rPr>
+              <w:t xml:space="preserve">내용</w:t>
+            </w:r>
+          </w:p>
+        </w:tc>
+        <w:tc>
+          <w:tcPr>
+            <w:tcW w:type="dxa" w:w="2900"/>
+            <w:tcBorders>
+              <w:top w:val="single" w:color="C9D8CC" w:sz="2"/>
+              <w:left w:val="single" w:color="C9D8CC" w:sz="2"/>
+              <w:bottom w:val="single" w:color="C9D8CC" w:sz="2"/>
+              <w:right w:val="single" w:color="C9D8CC" w:sz="2"/>
+            </w:tcBorders>
+            <w:shd w:fill="1B4332" w:val="clear"/>
+            <w:tcMar>
+              <w:top w:type="dxa" w:w="70"/>
+              <w:left w:type="dxa" w:w="110"/>
+              <w:bottom w:type="dxa" w:w="70"/>
+              <w:right w:type="dxa" w:w="110"/>
+            </w:tcMar>
+            <w:vAlign w:val="center"/>
+          </w:tcPr>
+          <w:p>
+            <w:pPr>
+              <w:spacing w:after="20" w:line="276"/>
+              <w:jc w:val="center"/>
+            </w:pPr>
+            <w:r>
+              <w:rPr>
+                <w:b/>
+                <w:bCs/>
+                <w:color w:val="FFFFFF"/>
+                <w:sz w:val="18"/>
+                <w:szCs w:val="18"/>
+              </w:rPr>
+              <w:t xml:space="preserve">가격(안)</w:t>
+            </w:r>
+          </w:p>
+        </w:tc>
+      </w:tr>
+      <w:tr>
+        <w:tc>
+          <w:tcPr>
+            <w:tcW w:type="dxa" w:w="2200"/>
+            <w:tcBorders>
+              <w:top w:val="single" w:color="C9D8CC" w:sz="2"/>
+              <w:left w:val="single" w:color="C9D8CC" w:sz="2"/>
+              <w:bottom w:val="single" w:color="C9D8CC" w:sz="2"/>
+              <w:right w:val="single" w:color="C9D8CC" w:sz="2"/>
+            </w:tcBorders>
+            <w:tcMar>
+              <w:top w:type="dxa" w:w="70"/>
+              <w:left w:type="dxa" w:w="110"/>
+              <w:bottom w:type="dxa" w:w="70"/>
+              <w:right w:type="dxa" w:w="110"/>
+            </w:tcMar>
+            <w:vAlign w:val="center"/>
+          </w:tcPr>
+          <w:p>
+            <w:pPr>
+              <w:spacing w:after="20" w:line="276"/>
+              <w:jc w:val="left"/>
+            </w:pPr>
+            <w:r>
+              <w:rPr>
+                <w:b w:val="false"/>
+                <w:bCs w:val="false"/>
+                <w:color w:val="1D2B22"/>
+                <w:sz w:val="18"/>
+                <w:szCs w:val="18"/>
+              </w:rPr>
+              <w:t xml:space="preserve">B2C 프리미엄 구독</w:t>
+            </w:r>
+          </w:p>
+        </w:tc>
+        <w:tc>
+          <w:tcPr>
+            <w:tcW w:type="dxa" w:w="4538"/>
+            <w:tcBorders>
+              <w:top w:val="single" w:color="C9D8CC" w:sz="2"/>
+              <w:left w:val="single" w:color="C9D8CC" w:sz="2"/>
+              <w:bottom w:val="single" w:color="C9D8CC" w:sz="2"/>
+              <w:right w:val="single" w:color="C9D8CC" w:sz="2"/>
+            </w:tcBorders>
+            <w:tcMar>
+              <w:top w:type="dxa" w:w="70"/>
+              <w:left w:type="dxa" w:w="110"/>
+              <w:bottom w:type="dxa" w:w="70"/>
+              <w:right w:type="dxa" w:w="110"/>
+            </w:tcMar>
+            <w:vAlign w:val="center"/>
+          </w:tcPr>
+          <w:p>
+            <w:pPr>
+              <w:spacing w:after="20" w:line="276"/>
+              <w:jc w:val="left"/>
+            </w:pPr>
+            <w:r>
+              <w:rPr>
+                <w:b w:val="false"/>
+                <w:bCs w:val="false"/>
+                <w:color w:val="1D2B22"/>
+                <w:sz w:val="18"/>
+                <w:szCs w:val="18"/>
+              </w:rPr>
+              <w:t xml:space="preserve">오프라인 지도 무제한·가족 안심 공유 확대·AI 무제한</w:t>
+            </w:r>
+          </w:p>
+        </w:tc>
+        <w:tc>
+          <w:tcPr>
+            <w:tcW w:type="dxa" w:w="2900"/>
+            <w:tcBorders>
+              <w:top w:val="single" w:color="C9D8CC" w:sz="2"/>
+              <w:left w:val="single" w:color="C9D8CC" w:sz="2"/>
+              <w:bottom w:val="single" w:color="C9D8CC" w:sz="2"/>
+              <w:right w:val="single" w:color="C9D8CC" w:sz="2"/>
+            </w:tcBorders>
+            <w:tcMar>
+              <w:top w:type="dxa" w:w="70"/>
+              <w:left w:type="dxa" w:w="110"/>
+              <w:bottom w:type="dxa" w:w="70"/>
+              <w:right w:type="dxa" w:w="110"/>
+            </w:tcMar>
+            <w:vAlign w:val="center"/>
+          </w:tcPr>
+          <w:p>
+            <w:pPr>
+              <w:spacing w:after="20" w:line="276"/>
+              <w:jc w:val="left"/>
+            </w:pPr>
+            <w:r>
+              <w:rPr>
+                <w:b w:val="false"/>
+                <w:bCs w:val="false"/>
+                <w:color w:val="1D2B22"/>
+                <w:sz w:val="18"/>
+                <w:szCs w:val="18"/>
+              </w:rPr>
+              <w:t xml:space="preserve">월 4,900원</w:t>
+            </w:r>
+          </w:p>
+        </w:tc>
+      </w:tr>
+      <w:tr>
+        <w:tc>
+          <w:tcPr>
+            <w:tcW w:type="dxa" w:w="2200"/>
+            <w:tcBorders>
+              <w:top w:val="single" w:color="C9D8CC" w:sz="2"/>
+              <w:left w:val="single" w:color="C9D8CC" w:sz="2"/>
+              <w:bottom w:val="single" w:color="C9D8CC" w:sz="2"/>
+              <w:right w:val="single" w:color="C9D8CC" w:sz="2"/>
+            </w:tcBorders>
+            <w:tcMar>
+              <w:top w:type="dxa" w:w="70"/>
+              <w:left w:type="dxa" w:w="110"/>
+              <w:bottom w:type="dxa" w:w="70"/>
+              <w:right w:type="dxa" w:w="110"/>
+            </w:tcMar>
+            <w:vAlign w:val="center"/>
+          </w:tcPr>
+          <w:p>
+            <w:pPr>
+              <w:spacing w:after="20" w:line="276"/>
+              <w:jc w:val="left"/>
+            </w:pPr>
+            <w:r>
+              <w:rPr>
+                <w:b w:val="false"/>
+                <w:bCs w:val="false"/>
+                <w:color w:val="1D2B22"/>
+                <w:sz w:val="18"/>
+                <w:szCs w:val="18"/>
+              </w:rPr>
+              <w:t xml:space="preserve">1일 안심보험 제휴</w:t>
+            </w:r>
+          </w:p>
+        </w:tc>
+        <w:tc>
+          <w:tcPr>
+            <w:tcW w:type="dxa" w:w="4538"/>
+            <w:tcBorders>
+              <w:top w:val="single" w:color="C9D8CC" w:sz="2"/>
+              <w:left w:val="single" w:color="C9D8CC" w:sz="2"/>
+              <w:bottom w:val="single" w:color="C9D8CC" w:sz="2"/>
+              <w:right w:val="single" w:color="C9D8CC" w:sz="2"/>
+            </w:tcBorders>
+            <w:tcMar>
+              <w:top w:type="dxa" w:w="70"/>
+              <w:left w:type="dxa" w:w="110"/>
+              <w:bottom w:type="dxa" w:w="70"/>
+              <w:right w:type="dxa" w:w="110"/>
+            </w:tcMar>
+            <w:vAlign w:val="center"/>
+          </w:tcPr>
+          <w:p>
+            <w:pPr>
+              <w:spacing w:after="20" w:line="276"/>
+              <w:jc w:val="left"/>
+            </w:pPr>
+            <w:r>
+              <w:rPr>
+                <w:b w:val="false"/>
+                <w:bCs w:val="false"/>
+                <w:color w:val="1D2B22"/>
+                <w:sz w:val="18"/>
+                <w:szCs w:val="18"/>
+              </w:rPr>
+              <w:t xml:space="preserve">산행지수 연동 일일보험 인앱 판매 — 판매 수수료</w:t>
+            </w:r>
+          </w:p>
+        </w:tc>
+        <w:tc>
+          <w:tcPr>
+            <w:tcW w:type="dxa" w:w="2900"/>
+            <w:tcBorders>
+              <w:top w:val="single" w:color="C9D8CC" w:sz="2"/>
+              <w:left w:val="single" w:color="C9D8CC" w:sz="2"/>
+              <w:bottom w:val="single" w:color="C9D8CC" w:sz="2"/>
+              <w:right w:val="single" w:color="C9D8CC" w:sz="2"/>
+            </w:tcBorders>
+            <w:tcMar>
+              <w:top w:type="dxa" w:w="70"/>
+              <w:left w:type="dxa" w:w="110"/>
+              <w:bottom w:type="dxa" w:w="70"/>
+              <w:right w:type="dxa" w:w="110"/>
+            </w:tcMar>
+            <w:vAlign w:val="center"/>
+          </w:tcPr>
+          <w:p>
+            <w:pPr>
+              <w:spacing w:after="20" w:line="276"/>
+              <w:jc w:val="left"/>
+            </w:pPr>
+            <w:r>
+              <w:rPr>
+                <w:b w:val="false"/>
+                <w:bCs w:val="false"/>
+                <w:color w:val="1D2B22"/>
+                <w:sz w:val="18"/>
+                <w:szCs w:val="18"/>
+              </w:rPr>
+              <w:t xml:space="preserve">건당 990원~ (수수료 15%)</w:t>
+            </w:r>
+          </w:p>
+        </w:tc>
+      </w:tr>
+      <w:tr>
+        <w:tc>
+          <w:tcPr>
+            <w:tcW w:type="dxa" w:w="2200"/>
+            <w:tcBorders>
+              <w:top w:val="single" w:color="C9D8CC" w:sz="2"/>
+              <w:left w:val="single" w:color="C9D8CC" w:sz="2"/>
+              <w:bottom w:val="single" w:color="C9D8CC" w:sz="2"/>
+              <w:right w:val="single" w:color="C9D8CC" w:sz="2"/>
+            </w:tcBorders>
+            <w:tcMar>
+              <w:top w:type="dxa" w:w="70"/>
+              <w:left w:type="dxa" w:w="110"/>
+              <w:bottom w:type="dxa" w:w="70"/>
+              <w:right w:type="dxa" w:w="110"/>
+            </w:tcMar>
+            <w:vAlign w:val="center"/>
+          </w:tcPr>
+          <w:p>
+            <w:pPr>
+              <w:spacing w:after="20" w:line="276"/>
+              <w:jc w:val="left"/>
+            </w:pPr>
+            <w:r>
+              <w:rPr>
+                <w:b w:val="false"/>
+                <w:bCs w:val="false"/>
+                <w:color w:val="1D2B22"/>
+                <w:sz w:val="18"/>
+                <w:szCs w:val="18"/>
+              </w:rPr>
+              <w:t xml:space="preserve">B2G 관제 SaaS</w:t>
+            </w:r>
+          </w:p>
+        </w:tc>
+        <w:tc>
+          <w:tcPr>
+            <w:tcW w:type="dxa" w:w="4538"/>
+            <w:tcBorders>
+              <w:top w:val="single" w:color="C9D8CC" w:sz="2"/>
+              <w:left w:val="single" w:color="C9D8CC" w:sz="2"/>
+              <w:bottom w:val="single" w:color="C9D8CC" w:sz="2"/>
+              <w:right w:val="single" w:color="C9D8CC" w:sz="2"/>
+            </w:tcBorders>
+            <w:tcMar>
+              <w:top w:type="dxa" w:w="70"/>
+              <w:left w:type="dxa" w:w="110"/>
+              <w:bottom w:type="dxa" w:w="70"/>
+              <w:right w:type="dxa" w:w="110"/>
+            </w:tcMar>
+            <w:vAlign w:val="center"/>
+          </w:tcPr>
+          <w:p>
+            <w:pPr>
+              <w:spacing w:after="20" w:line="276"/>
+              <w:jc w:val="left"/>
+            </w:pPr>
+            <w:r>
+              <w:rPr>
+                <w:b w:val="false"/>
+                <w:bCs w:val="false"/>
+                <w:color w:val="1D2B22"/>
+                <w:sz w:val="18"/>
+                <w:szCs w:val="18"/>
+              </w:rPr>
+              <w:t xml:space="preserve">지자체·국립공원·소방 대시보드 라이선스</w:t>
+            </w:r>
+          </w:p>
+        </w:tc>
+        <w:tc>
+          <w:tcPr>
+            <w:tcW w:type="dxa" w:w="2900"/>
+            <w:tcBorders>
+              <w:top w:val="single" w:color="C9D8CC" w:sz="2"/>
+              <w:left w:val="single" w:color="C9D8CC" w:sz="2"/>
+              <w:bottom w:val="single" w:color="C9D8CC" w:sz="2"/>
+              <w:right w:val="single" w:color="C9D8CC" w:sz="2"/>
+            </w:tcBorders>
+            <w:tcMar>
+              <w:top w:type="dxa" w:w="70"/>
+              <w:left w:type="dxa" w:w="110"/>
+              <w:bottom w:type="dxa" w:w="70"/>
+              <w:right w:type="dxa" w:w="110"/>
+            </w:tcMar>
+            <w:vAlign w:val="center"/>
+          </w:tcPr>
+          <w:p>
+            <w:pPr>
+              <w:spacing w:after="20" w:line="276"/>
+              <w:jc w:val="left"/>
+            </w:pPr>
+            <w:r>
+              <w:rPr>
+                <w:b w:val="false"/>
+                <w:bCs w:val="false"/>
+                <w:color w:val="1D2B22"/>
+                <w:sz w:val="18"/>
+                <w:szCs w:val="18"/>
+              </w:rPr>
+              <w:t xml:space="preserve">기관당 연 3~8천만 원</w:t>
+            </w:r>
+          </w:p>
+        </w:tc>
+      </w:tr>
+      <w:tr>
+        <w:tc>
+          <w:tcPr>
+            <w:tcW w:type="dxa" w:w="2200"/>
+            <w:tcBorders>
+              <w:top w:val="single" w:color="C9D8CC" w:sz="2"/>
+              <w:left w:val="single" w:color="C9D8CC" w:sz="2"/>
+              <w:bottom w:val="single" w:color="C9D8CC" w:sz="2"/>
+              <w:right w:val="single" w:color="C9D8CC" w:sz="2"/>
+            </w:tcBorders>
+            <w:tcMar>
+              <w:top w:type="dxa" w:w="70"/>
+              <w:left w:type="dxa" w:w="110"/>
+              <w:bottom w:type="dxa" w:w="70"/>
+              <w:right w:type="dxa" w:w="110"/>
+            </w:tcMar>
+            <w:vAlign w:val="center"/>
+          </w:tcPr>
+          <w:p>
+            <w:pPr>
+              <w:spacing w:after="20" w:line="276"/>
+              <w:jc w:val="left"/>
+            </w:pPr>
+            <w:r>
+              <w:rPr>
+                <w:b w:val="false"/>
+                <w:bCs w:val="false"/>
+                <w:color w:val="1D2B22"/>
+                <w:sz w:val="18"/>
+                <w:szCs w:val="18"/>
+              </w:rPr>
+              <w:t xml:space="preserve">제휴·커머스</w:t>
+            </w:r>
+          </w:p>
+        </w:tc>
+        <w:tc>
+          <w:tcPr>
+            <w:tcW w:type="dxa" w:w="4538"/>
+            <w:tcBorders>
+              <w:top w:val="single" w:color="C9D8CC" w:sz="2"/>
+              <w:left w:val="single" w:color="C9D8CC" w:sz="2"/>
+              <w:bottom w:val="single" w:color="C9D8CC" w:sz="2"/>
+              <w:right w:val="single" w:color="C9D8CC" w:sz="2"/>
+            </w:tcBorders>
+            <w:tcMar>
+              <w:top w:type="dxa" w:w="70"/>
+              <w:left w:type="dxa" w:w="110"/>
+              <w:bottom w:type="dxa" w:w="70"/>
+              <w:right w:type="dxa" w:w="110"/>
+            </w:tcMar>
+            <w:vAlign w:val="center"/>
+          </w:tcPr>
+          <w:p>
+            <w:pPr>
+              <w:spacing w:after="20" w:line="276"/>
+              <w:jc w:val="left"/>
+            </w:pPr>
+            <w:r>
+              <w:rPr>
+                <w:b w:val="false"/>
+                <w:bCs w:val="false"/>
+                <w:color w:val="1D2B22"/>
+                <w:sz w:val="18"/>
+                <w:szCs w:val="18"/>
+              </w:rPr>
+              <w:t xml:space="preserve">아웃도어 브랜드 제휴·휴양림 예약 수수료</w:t>
+            </w:r>
+          </w:p>
+        </w:tc>
+        <w:tc>
+          <w:tcPr>
+            <w:tcW w:type="dxa" w:w="2900"/>
+            <w:tcBorders>
+              <w:top w:val="single" w:color="C9D8CC" w:sz="2"/>
+              <w:left w:val="single" w:color="C9D8CC" w:sz="2"/>
+              <w:bottom w:val="single" w:color="C9D8CC" w:sz="2"/>
+              <w:right w:val="single" w:color="C9D8CC" w:sz="2"/>
+            </w:tcBorders>
+            <w:tcMar>
+              <w:top w:type="dxa" w:w="70"/>
+              <w:left w:type="dxa" w:w="110"/>
+              <w:bottom w:type="dxa" w:w="70"/>
+              <w:right w:type="dxa" w:w="110"/>
+            </w:tcMar>
+            <w:vAlign w:val="center"/>
+          </w:tcPr>
+          <w:p>
+            <w:pPr>
+              <w:spacing w:after="20" w:line="276"/>
+              <w:jc w:val="left"/>
+            </w:pPr>
+            <w:r>
+              <w:rPr>
+                <w:b w:val="false"/>
+                <w:bCs w:val="false"/>
+                <w:color w:val="1D2B22"/>
+                <w:sz w:val="18"/>
+                <w:szCs w:val="18"/>
+              </w:rPr>
+              <w:t xml:space="preserve">예약 건당 5~10%</w:t>
+            </w:r>
+          </w:p>
+        </w:tc>
+      </w:tr>
+    </w:tbl>
     <w:p>
       <w:pPr>
         <w:spacing w:after="80" w:before="80"/>
@@ -7214,9 +7092,9 @@
       <w:r>
         <w:drawing>
           <wp:inline distT="0" distB="0" distL="0" distR="0">
-            <wp:extent cx="5905500" cy="2219325"/>
+            <wp:extent cx="5334000" cy="2447925"/>
             <wp:effectExtent t="0" r="0" b="0" l="0"/>
-            <wp:docPr id="1" name="roadmap.png" descr="roadmap.png" title="roadmap.png"/>
+            <wp:docPr id="1" name="chart_revenue.png" descr="chart_revenue.png" title="chart_revenue.png"/>
             <wp:cNvGraphicFramePr>
               <a:graphicFrameLocks xmlns:a="http://schemas.openxmlformats.org/drawingml/2006/main" noChangeAspect="1"/>
             </wp:cNvGraphicFramePr>
@@ -7239,7 +7117,7 @@
                   <pic:spPr bwMode="auto">
                     <a:xfrm>
                       <a:off x="0" y="0"/>
-                      <a:ext cx="5905500" cy="2219325"/>
+                      <a:ext cx="5334000" cy="2447925"/>
                     </a:xfrm>
                     <a:prstGeom prst="rect">
                       <a:avLst/>
@@ -7253,25 +7131,17 @@
       </w:r>
     </w:p>
     <w:p>
-      <w:r>
-        <w:br w:type="page"/>
-      </w:r>
-    </w:p>
-    <w:p>
-      <w:pPr>
-        <w:pStyle w:val="Heading1"/>
-        <w:pBdr>
-          <w:bottom w:val="single" w:color="40916C" w:sz="10" w:space="2"/>
-        </w:pBdr>
-        <w:spacing w:after="160" w:before="360"/>
-      </w:pPr>
-      <w:r>
-        <w:rPr>
-          <w:b/>
-          <w:bCs/>
-          <w:color w:val="1B4332"/>
-        </w:rPr>
-        <w:t xml:space="preserve">6. 사회적 가치 창출 (기대효과)</w:t>
+      <w:pPr>
+        <w:spacing w:after="200" w:before="20"/>
+        <w:jc w:val="center"/>
+      </w:pPr>
+      <w:r>
+        <w:rPr>
+          <w:color w:val="6B7F72"/>
+          <w:sz w:val="16"/>
+          <w:szCs w:val="16"/>
+        </w:rPr>
+        <w:t xml:space="preserve">가정: 1차년도 MAU 8만(서울·수도권 명산) → 3차년도 90만(전국+인바운드), 유료 전환율 4→6%, B2G 2→10개 기관 · 자체 추정</w:t>
       </w:r>
     </w:p>
     <w:p>
@@ -7285,7 +7155,117 @@
           <w:bCs/>
           <w:color w:val="2D6A4F"/>
         </w:rPr>
-        <w:t xml:space="preserve">6-1. 우리가 푸는 문제</w:t>
+        <w:t xml:space="preserve">5-3. 마케팅·사업 활성화 방안</w:t>
+      </w:r>
+    </w:p>
+    <w:p>
+      <w:pPr>
+        <w:pStyle w:val="ListParagraph"/>
+        <w:numPr>
+          <w:ilvl w:val="0"/>
+          <w:numId w:val="2"/>
+        </w:numPr>
+        <w:spacing w:after="80" w:line="300"/>
+      </w:pPr>
+      <w:r>
+        <w:rPr>
+          <w:b/>
+          <w:bCs/>
+          <w:color w:val="1D2B22"/>
+        </w:rPr>
+        <w:t xml:space="preserve">공공 협력 채널: </w:t>
+      </w:r>
+      <w:r>
+        <w:rPr>
+          <w:color w:val="1D2B22"/>
+        </w:rPr>
+        <w:t xml:space="preserve">산림청 ‘숲나들e’·국가숲길 캠페인 연계, 지자체 시범사업(분담금 매칭)으로 초기 신뢰 확보</w:t>
+      </w:r>
+    </w:p>
+    <w:p>
+      <w:pPr>
+        <w:pStyle w:val="ListParagraph"/>
+        <w:numPr>
+          <w:ilvl w:val="0"/>
+          <w:numId w:val="2"/>
+        </w:numPr>
+        <w:spacing w:after="80" w:line="300"/>
+      </w:pPr>
+      <w:r>
+        <w:rPr>
+          <w:b/>
+          <w:bCs/>
+          <w:color w:val="1D2B22"/>
+        </w:rPr>
+        <w:t xml:space="preserve">커뮤니티 침투: </w:t>
+      </w:r>
+      <w:r>
+        <w:rPr>
+          <w:color w:val="1D2B22"/>
+        </w:rPr>
+        <w:t xml:space="preserve">산악회·등산 크루(2030 ‘산스타그램’) 안전 챌린지, 무사고 배지 리워드</w:t>
+      </w:r>
+    </w:p>
+    <w:p>
+      <w:pPr>
+        <w:pStyle w:val="ListParagraph"/>
+        <w:numPr>
+          <w:ilvl w:val="0"/>
+          <w:numId w:val="2"/>
+        </w:numPr>
+        <w:spacing w:after="80" w:line="300"/>
+      </w:pPr>
+      <w:r>
+        <w:rPr>
+          <w:b/>
+          <w:bCs/>
+          <w:color w:val="1D2B22"/>
+        </w:rPr>
+        <w:t xml:space="preserve">제휴 마케팅: </w:t>
+      </w:r>
+      <w:r>
+        <w:rPr>
+          <w:color w:val="1D2B22"/>
+        </w:rPr>
+        <w:t xml:space="preserve">아웃도어 브랜드 멤버십 연동, 보험사 공동 프로모션(가입 시 첫 달 구독 무료)</w:t>
+      </w:r>
+    </w:p>
+    <w:p>
+      <w:pPr>
+        <w:pStyle w:val="ListParagraph"/>
+        <w:numPr>
+          <w:ilvl w:val="0"/>
+          <w:numId w:val="2"/>
+        </w:numPr>
+        <w:spacing w:after="80" w:line="300"/>
+      </w:pPr>
+      <w:r>
+        <w:rPr>
+          <w:b/>
+          <w:bCs/>
+          <w:color w:val="1D2B22"/>
+        </w:rPr>
+        <w:t xml:space="preserve">인바운드: </w:t>
+      </w:r>
+      <w:r>
+        <w:rPr>
+          <w:color w:val="1D2B22"/>
+        </w:rPr>
+        <w:t xml:space="preserve">관광공사·트레킹 여행사 제휴로 다국어 AI 가이드를 외국인 패키지에 번들</w:t>
+      </w:r>
+    </w:p>
+    <w:p>
+      <w:pPr>
+        <w:pStyle w:val="Heading2"/>
+        <w:spacing w:after="120" w:before="240"/>
+      </w:pPr>
+      <w:r>
+        <w:rPr>
+          <w:b/>
+          <w:bCs/>
+          <w:color w:val="2D6A4F"/>
+        </w:rPr>
+        <w:t xml:space="preserve">5-4. 사업화 로드맵</w:t>
       </w:r>
     </w:p>
     <w:p>
@@ -7296,9 +7276,9 @@
       <w:r>
         <w:drawing>
           <wp:inline distT="0" distB="0" distL="0" distR="0">
-            <wp:extent cx="5905500" cy="1866900"/>
+            <wp:extent cx="5905500" cy="2219325"/>
             <wp:effectExtent t="0" r="0" b="0" l="0"/>
-            <wp:docPr id="1" name="chart_accident.png" descr="chart_accident.png" title="chart_accident.png"/>
+            <wp:docPr id="1" name="roadmap.png" descr="roadmap.png" title="roadmap.png"/>
             <wp:cNvGraphicFramePr>
               <a:graphicFrameLocks xmlns:a="http://schemas.openxmlformats.org/drawingml/2006/main" noChangeAspect="1"/>
             </wp:cNvGraphicFramePr>
@@ -7321,7 +7301,7 @@
                   <pic:spPr bwMode="auto">
                     <a:xfrm>
                       <a:off x="0" y="0"/>
-                      <a:ext cx="5905500" cy="1866900"/>
+                      <a:ext cx="5905500" cy="2219325"/>
                     </a:xfrm>
                     <a:prstGeom prst="rect">
                       <a:avLst/>
@@ -7335,17 +7315,39 @@
       </w:r>
     </w:p>
     <w:p>
-      <w:pPr>
-        <w:spacing w:after="200" w:before="20"/>
-        <w:jc w:val="center"/>
-      </w:pPr>
-      <w:r>
-        <w:rPr>
-          <w:color w:val="6B7F72"/>
-          <w:sz w:val="16"/>
-          <w:szCs w:val="16"/>
-        </w:rPr>
-        <w:t xml:space="preserve">출처: 소방청 구조활동 통계(2022–2024), 대한민국 정책브리핑 보도</w:t>
+      <w:r>
+        <w:br w:type="page"/>
+      </w:r>
+    </w:p>
+    <w:p>
+      <w:pPr>
+        <w:pStyle w:val="Heading1"/>
+        <w:pBdr>
+          <w:bottom w:val="single" w:color="40916C" w:sz="10" w:space="2"/>
+        </w:pBdr>
+        <w:spacing w:after="160" w:before="360"/>
+      </w:pPr>
+      <w:r>
+        <w:rPr>
+          <w:b/>
+          <w:bCs/>
+          <w:color w:val="1B4332"/>
+        </w:rPr>
+        <w:t xml:space="preserve">6. 사회적 가치 창출 (기대효과)</w:t>
+      </w:r>
+    </w:p>
+    <w:p>
+      <w:pPr>
+        <w:pStyle w:val="Heading2"/>
+        <w:spacing w:after="120" w:before="240"/>
+      </w:pPr>
+      <w:r>
+        <w:rPr>
+          <w:b/>
+          <w:bCs/>
+          <w:color w:val="2D6A4F"/>
+        </w:rPr>
+        <w:t xml:space="preserve">6-1. 우리가 푸는 문제</w:t>
       </w:r>
     </w:p>
     <w:p>
@@ -7356,9 +7358,9 @@
       <w:r>
         <w:drawing>
           <wp:inline distT="0" distB="0" distL="0" distR="0">
-            <wp:extent cx="5143500" cy="2466975"/>
+            <wp:extent cx="5905500" cy="1866900"/>
             <wp:effectExtent t="0" r="0" b="0" l="0"/>
-            <wp:docPr id="1" name="chart_population.png" descr="chart_population.png" title="chart_population.png"/>
+            <wp:docPr id="1" name="chart_accident.png" descr="chart_accident.png" title="chart_accident.png"/>
             <wp:cNvGraphicFramePr>
               <a:graphicFrameLocks xmlns:a="http://schemas.openxmlformats.org/drawingml/2006/main" noChangeAspect="1"/>
             </wp:cNvGraphicFramePr>
@@ -7381,6 +7383,66 @@
                   <pic:spPr bwMode="auto">
                     <a:xfrm>
                       <a:off x="0" y="0"/>
+                      <a:ext cx="5905500" cy="1866900"/>
+                    </a:xfrm>
+                    <a:prstGeom prst="rect">
+                      <a:avLst/>
+                    </a:prstGeom>
+                  </pic:spPr>
+                </pic:pic>
+              </a:graphicData>
+            </a:graphic>
+          </wp:inline>
+        </w:drawing>
+      </w:r>
+    </w:p>
+    <w:p>
+      <w:pPr>
+        <w:spacing w:after="200" w:before="20"/>
+        <w:jc w:val="center"/>
+      </w:pPr>
+      <w:r>
+        <w:rPr>
+          <w:color w:val="6B7F72"/>
+          <w:sz w:val="16"/>
+          <w:szCs w:val="16"/>
+        </w:rPr>
+        <w:t xml:space="preserve">출처: 소방청 구조활동 통계(2022–2024), 대한민국 정책브리핑 보도</w:t>
+      </w:r>
+    </w:p>
+    <w:p>
+      <w:pPr>
+        <w:spacing w:after="80" w:before="80"/>
+        <w:jc w:val="center"/>
+      </w:pPr>
+      <w:r>
+        <w:drawing>
+          <wp:inline distT="0" distB="0" distL="0" distR="0">
+            <wp:extent cx="5143500" cy="2466975"/>
+            <wp:effectExtent t="0" r="0" b="0" l="0"/>
+            <wp:docPr id="1" name="chart_population.png" descr="chart_population.png" title="chart_population.png"/>
+            <wp:cNvGraphicFramePr>
+              <a:graphicFrameLocks xmlns:a="http://schemas.openxmlformats.org/drawingml/2006/main" noChangeAspect="1"/>
+            </wp:cNvGraphicFramePr>
+            <a:graphic xmlns:a="http://schemas.openxmlformats.org/drawingml/2006/main">
+              <a:graphicData uri="http://schemas.openxmlformats.org/drawingml/2006/picture">
+                <pic:pic xmlns:pic="http://schemas.openxmlformats.org/drawingml/2006/picture">
+                  <pic:nvPicPr>
+                    <pic:cNvPr id="0" name="" descr=""/>
+                    <pic:cNvPicPr>
+                      <a:picLocks noChangeAspect="1" noChangeArrowheads="1"/>
+                    </pic:cNvPicPr>
+                  </pic:nvPicPr>
+                  <pic:blipFill>
+                    <a:blip r:embed="rId21" cstate="none"/>
+                    <a:srcRect/>
+                    <a:stretch>
+                      <a:fillRect/>
+                    </a:stretch>
+                  </pic:blipFill>
+                  <pic:spPr bwMode="auto">
+                    <a:xfrm>
+                      <a:off x="0" y="0"/>
                       <a:ext cx="5143500" cy="2466975"/>
                     </a:xfrm>
                     <a:prstGeom prst="rect">
@@ -7432,7 +7494,7 @@
                     </pic:cNvPicPr>
                   </pic:nvPicPr>
                   <pic:blipFill>
-                    <a:blip r:embed="rId21" cstate="none"/>
+                    <a:blip r:embed="rId22" cstate="none"/>
                     <a:srcRect/>
                     <a:stretch>
                       <a:fillRect/>

</xml_diff>